<commit_message>
Update Watanabe MS Thesis 2026.docx
</commit_message>
<xml_diff>
--- a/Watanabe MS Thesis 2026.docx
+++ b/Watanabe MS Thesis 2026.docx
@@ -353,7 +353,6 @@
           <w:r>
             <w:t xml:space="preserve">Brandon </w:t>
           </w:r>
-          <w:proofErr w:type="spellStart"/>
           <w:r>
             <w:t>R.</w:t>
           </w:r>
@@ -364,7 +363,6 @@
           <w:r>
             <w:t>Watanabe</w:t>
           </w:r>
-          <w:proofErr w:type="spellEnd"/>
           <w:proofErr w:type="gramEnd"/>
         </w:sdtContent>
       </w:sdt>
@@ -594,7 +592,7 @@
       <w:bookmarkStart w:id="15" w:name="_Toc76637242"/>
       <w:bookmarkStart w:id="16" w:name="_Toc77082421"/>
       <w:bookmarkStart w:id="17" w:name="_Toc81911070"/>
-      <w:bookmarkStart w:id="18" w:name="_Toc228126978"/>
+      <w:bookmarkStart w:id="18" w:name="_Toc228129434"/>
       <w:commentRangeStart w:id="19"/>
       <w:r>
         <w:lastRenderedPageBreak/>
@@ -1507,7 +1505,7 @@
         <w:br w:type="page"/>
       </w:r>
     </w:p>
-    <w:bookmarkStart w:id="28" w:name="_Toc228126979" w:displacedByCustomXml="next"/>
+    <w:bookmarkStart w:id="28" w:name="_Toc228129435" w:displacedByCustomXml="next"/>
     <w:bookmarkStart w:id="29" w:name="_Toc81911071" w:displacedByCustomXml="next"/>
     <w:bookmarkStart w:id="30" w:name="_Toc76631495" w:displacedByCustomXml="next"/>
     <w:bookmarkStart w:id="31" w:name="_Toc76630901" w:displacedByCustomXml="next"/>
@@ -1679,7 +1677,7 @@
         <w:pStyle w:val="Heading2"/>
       </w:pPr>
       <w:bookmarkStart w:id="44" w:name="_Toc81911072"/>
-      <w:bookmarkStart w:id="45" w:name="_Toc228126980"/>
+      <w:bookmarkStart w:id="45" w:name="_Toc228129436"/>
       <w:commentRangeStart w:id="46"/>
       <w:r>
         <w:lastRenderedPageBreak/>
@@ -1836,7 +1834,7 @@
         <w:pStyle w:val="Heading2"/>
       </w:pPr>
       <w:bookmarkStart w:id="47" w:name="_Toc81911073"/>
-      <w:bookmarkStart w:id="48" w:name="_Toc228126981"/>
+      <w:bookmarkStart w:id="48" w:name="_Toc228129437"/>
       <w:commentRangeStart w:id="49"/>
       <w:r>
         <w:lastRenderedPageBreak/>
@@ -2024,7 +2022,7 @@
       <w:bookmarkStart w:id="55" w:name="_Toc76637244"/>
       <w:bookmarkStart w:id="56" w:name="_Toc77082423"/>
       <w:bookmarkStart w:id="57" w:name="_Toc81911074"/>
-      <w:bookmarkStart w:id="58" w:name="_Toc228126982"/>
+      <w:bookmarkStart w:id="58" w:name="_Toc228129438"/>
       <w:commentRangeStart w:id="59"/>
       <w:r>
         <w:lastRenderedPageBreak/>
@@ -2075,7 +2073,7 @@
           <w14:ligatures w14:val="standardContextual"/>
         </w:rPr>
       </w:pPr>
-      <w:hyperlink w:anchor="_Toc228126978" w:history="1">
+      <w:hyperlink w:anchor="_Toc228129434" w:history="1">
         <w:r>
           <w:rPr>
             <w:rStyle w:val="Hyperlink"/>
@@ -2102,7 +2100,7 @@
             <w:noProof/>
             <w:webHidden/>
           </w:rPr>
-          <w:instrText xml:space="preserve"> PAGEREF _Toc228126978 \h </w:instrText>
+          <w:instrText xml:space="preserve"> PAGEREF _Toc228129434 \h </w:instrText>
         </w:r>
         <w:r>
           <w:rPr>
@@ -2149,7 +2147,7 @@
           <w14:ligatures w14:val="standardContextual"/>
         </w:rPr>
       </w:pPr>
-      <w:hyperlink w:anchor="_Toc228126979" w:history="1">
+      <w:hyperlink w:anchor="_Toc228129435" w:history="1">
         <w:r>
           <w:rPr>
             <w:rStyle w:val="Hyperlink"/>
@@ -2176,7 +2174,7 @@
             <w:noProof/>
             <w:webHidden/>
           </w:rPr>
-          <w:instrText xml:space="preserve"> PAGEREF _Toc228126979 \h </w:instrText>
+          <w:instrText xml:space="preserve"> PAGEREF _Toc228129435 \h </w:instrText>
         </w:r>
         <w:r>
           <w:rPr>
@@ -2223,7 +2221,7 @@
           <w14:ligatures w14:val="standardContextual"/>
         </w:rPr>
       </w:pPr>
-      <w:hyperlink w:anchor="_Toc228126980" w:history="1">
+      <w:hyperlink w:anchor="_Toc228129436" w:history="1">
         <w:r>
           <w:rPr>
             <w:rStyle w:val="Hyperlink"/>
@@ -2250,7 +2248,7 @@
             <w:noProof/>
             <w:webHidden/>
           </w:rPr>
-          <w:instrText xml:space="preserve"> PAGEREF _Toc228126980 \h </w:instrText>
+          <w:instrText xml:space="preserve"> PAGEREF _Toc228129436 \h </w:instrText>
         </w:r>
         <w:r>
           <w:rPr>
@@ -2297,7 +2295,7 @@
           <w14:ligatures w14:val="standardContextual"/>
         </w:rPr>
       </w:pPr>
-      <w:hyperlink w:anchor="_Toc228126981" w:history="1">
+      <w:hyperlink w:anchor="_Toc228129437" w:history="1">
         <w:r>
           <w:rPr>
             <w:rStyle w:val="Hyperlink"/>
@@ -2324,7 +2322,7 @@
             <w:noProof/>
             <w:webHidden/>
           </w:rPr>
-          <w:instrText xml:space="preserve"> PAGEREF _Toc228126981 \h </w:instrText>
+          <w:instrText xml:space="preserve"> PAGEREF _Toc228129437 \h </w:instrText>
         </w:r>
         <w:r>
           <w:rPr>
@@ -2371,7 +2369,7 @@
           <w14:ligatures w14:val="standardContextual"/>
         </w:rPr>
       </w:pPr>
-      <w:hyperlink w:anchor="_Toc228126982" w:history="1">
+      <w:hyperlink w:anchor="_Toc228129438" w:history="1">
         <w:r>
           <w:rPr>
             <w:rStyle w:val="Hyperlink"/>
@@ -2398,7 +2396,7 @@
             <w:noProof/>
             <w:webHidden/>
           </w:rPr>
-          <w:instrText xml:space="preserve"> PAGEREF _Toc228126982 \h </w:instrText>
+          <w:instrText xml:space="preserve"> PAGEREF _Toc228129438 \h </w:instrText>
         </w:r>
         <w:r>
           <w:rPr>
@@ -2445,7 +2443,7 @@
           <w14:ligatures w14:val="standardContextual"/>
         </w:rPr>
       </w:pPr>
-      <w:hyperlink w:anchor="_Toc228126983" w:history="1">
+      <w:hyperlink w:anchor="_Toc228129439" w:history="1">
         <w:r>
           <w:rPr>
             <w:rStyle w:val="Hyperlink"/>
@@ -2472,7 +2470,7 @@
             <w:noProof/>
             <w:webHidden/>
           </w:rPr>
-          <w:instrText xml:space="preserve"> PAGEREF _Toc228126983 \h </w:instrText>
+          <w:instrText xml:space="preserve"> PAGEREF _Toc228129439 \h </w:instrText>
         </w:r>
         <w:r>
           <w:rPr>
@@ -2519,7 +2517,7 @@
           <w14:ligatures w14:val="standardContextual"/>
         </w:rPr>
       </w:pPr>
-      <w:hyperlink w:anchor="_Toc228126984" w:history="1">
+      <w:hyperlink w:anchor="_Toc228129440" w:history="1">
         <w:r>
           <w:rPr>
             <w:rStyle w:val="Hyperlink"/>
@@ -2546,7 +2544,7 @@
             <w:noProof/>
             <w:webHidden/>
           </w:rPr>
-          <w:instrText xml:space="preserve"> PAGEREF _Toc228126984 \h </w:instrText>
+          <w:instrText xml:space="preserve"> PAGEREF _Toc228129440 \h </w:instrText>
         </w:r>
         <w:r>
           <w:rPr>
@@ -2593,7 +2591,7 @@
           <w14:ligatures w14:val="standardContextual"/>
         </w:rPr>
       </w:pPr>
-      <w:hyperlink w:anchor="_Toc228126985" w:history="1">
+      <w:hyperlink w:anchor="_Toc228129441" w:history="1">
         <w:r>
           <w:rPr>
             <w:rStyle w:val="Hyperlink"/>
@@ -2620,7 +2618,7 @@
             <w:noProof/>
             <w:webHidden/>
           </w:rPr>
-          <w:instrText xml:space="preserve"> PAGEREF _Toc228126985 \h </w:instrText>
+          <w:instrText xml:space="preserve"> PAGEREF _Toc228129441 \h </w:instrText>
         </w:r>
         <w:r>
           <w:rPr>
@@ -2667,7 +2665,7 @@
           <w14:ligatures w14:val="standardContextual"/>
         </w:rPr>
       </w:pPr>
-      <w:hyperlink w:anchor="_Toc228126986" w:history="1">
+      <w:hyperlink w:anchor="_Toc228129442" w:history="1">
         <w:r>
           <w:rPr>
             <w:rStyle w:val="Hyperlink"/>
@@ -2694,7 +2692,7 @@
             <w:noProof/>
             <w:webHidden/>
           </w:rPr>
-          <w:instrText xml:space="preserve"> PAGEREF _Toc228126986 \h </w:instrText>
+          <w:instrText xml:space="preserve"> PAGEREF _Toc228129442 \h </w:instrText>
         </w:r>
         <w:r>
           <w:rPr>
@@ -2741,7 +2739,7 @@
           <w14:ligatures w14:val="standardContextual"/>
         </w:rPr>
       </w:pPr>
-      <w:hyperlink w:anchor="_Toc228126987" w:history="1">
+      <w:hyperlink w:anchor="_Toc228129443" w:history="1">
         <w:r>
           <w:rPr>
             <w:rStyle w:val="Hyperlink"/>
@@ -2768,7 +2766,7 @@
             <w:noProof/>
             <w:webHidden/>
           </w:rPr>
-          <w:instrText xml:space="preserve"> PAGEREF _Toc228126987 \h </w:instrText>
+          <w:instrText xml:space="preserve"> PAGEREF _Toc228129443 \h </w:instrText>
         </w:r>
         <w:r>
           <w:rPr>
@@ -2813,7 +2811,7 @@
           <w14:ligatures w14:val="standardContextual"/>
         </w:rPr>
       </w:pPr>
-      <w:hyperlink w:anchor="_Toc228126988" w:history="1">
+      <w:hyperlink w:anchor="_Toc228129444" w:history="1">
         <w:r>
           <w:rPr>
             <w:rStyle w:val="Hyperlink"/>
@@ -2840,7 +2838,7 @@
             <w:noProof/>
             <w:webHidden/>
           </w:rPr>
-          <w:instrText xml:space="preserve"> PAGEREF _Toc228126988 \h </w:instrText>
+          <w:instrText xml:space="preserve"> PAGEREF _Toc228129444 \h </w:instrText>
         </w:r>
         <w:r>
           <w:rPr>
@@ -2885,7 +2883,7 @@
           <w14:ligatures w14:val="standardContextual"/>
         </w:rPr>
       </w:pPr>
-      <w:hyperlink w:anchor="_Toc228126989" w:history="1">
+      <w:hyperlink w:anchor="_Toc228129445" w:history="1">
         <w:r>
           <w:rPr>
             <w:rStyle w:val="Hyperlink"/>
@@ -2913,7 +2911,7 @@
             <w:noProof/>
             <w:webHidden/>
           </w:rPr>
-          <w:instrText xml:space="preserve"> PAGEREF _Toc228126989 \h </w:instrText>
+          <w:instrText xml:space="preserve"> PAGEREF _Toc228129445 \h </w:instrText>
         </w:r>
         <w:r>
           <w:rPr>
@@ -2958,7 +2956,7 @@
           <w14:ligatures w14:val="standardContextual"/>
         </w:rPr>
       </w:pPr>
-      <w:hyperlink w:anchor="_Toc228126990" w:history="1">
+      <w:hyperlink w:anchor="_Toc228129446" w:history="1">
         <w:r>
           <w:rPr>
             <w:rStyle w:val="Hyperlink"/>
@@ -2986,7 +2984,7 @@
             <w:noProof/>
             <w:webHidden/>
           </w:rPr>
-          <w:instrText xml:space="preserve"> PAGEREF _Toc228126990 \h </w:instrText>
+          <w:instrText xml:space="preserve"> PAGEREF _Toc228129446 \h </w:instrText>
         </w:r>
         <w:r>
           <w:rPr>
@@ -3031,7 +3029,7 @@
           <w14:ligatures w14:val="standardContextual"/>
         </w:rPr>
       </w:pPr>
-      <w:hyperlink w:anchor="_Toc228126991" w:history="1">
+      <w:hyperlink w:anchor="_Toc228129447" w:history="1">
         <w:r>
           <w:rPr>
             <w:rStyle w:val="Hyperlink"/>
@@ -3058,7 +3056,7 @@
             <w:noProof/>
             <w:webHidden/>
           </w:rPr>
-          <w:instrText xml:space="preserve"> PAGEREF _Toc228126991 \h </w:instrText>
+          <w:instrText xml:space="preserve"> PAGEREF _Toc228129447 \h </w:instrText>
         </w:r>
         <w:r>
           <w:rPr>
@@ -3104,7 +3102,7 @@
           <w14:ligatures w14:val="standardContextual"/>
         </w:rPr>
       </w:pPr>
-      <w:hyperlink w:anchor="_Toc228126992" w:history="1">
+      <w:hyperlink w:anchor="_Toc228129448" w:history="1">
         <w:r>
           <w:rPr>
             <w:rStyle w:val="Hyperlink"/>
@@ -3131,7 +3129,7 @@
             <w:noProof/>
             <w:webHidden/>
           </w:rPr>
-          <w:instrText xml:space="preserve"> PAGEREF _Toc228126992 \h </w:instrText>
+          <w:instrText xml:space="preserve"> PAGEREF _Toc228129448 \h </w:instrText>
         </w:r>
         <w:r>
           <w:rPr>
@@ -3177,7 +3175,7 @@
           <w14:ligatures w14:val="standardContextual"/>
         </w:rPr>
       </w:pPr>
-      <w:hyperlink w:anchor="_Toc228126993" w:history="1">
+      <w:hyperlink w:anchor="_Toc228129449" w:history="1">
         <w:r>
           <w:rPr>
             <w:rStyle w:val="Hyperlink"/>
@@ -3204,7 +3202,7 @@
             <w:noProof/>
             <w:webHidden/>
           </w:rPr>
-          <w:instrText xml:space="preserve"> PAGEREF _Toc228126993 \h </w:instrText>
+          <w:instrText xml:space="preserve"> PAGEREF _Toc228129449 \h </w:instrText>
         </w:r>
         <w:r>
           <w:rPr>
@@ -3249,7 +3247,7 @@
           <w14:ligatures w14:val="standardContextual"/>
         </w:rPr>
       </w:pPr>
-      <w:hyperlink w:anchor="_Toc228126994" w:history="1">
+      <w:hyperlink w:anchor="_Toc228129450" w:history="1">
         <w:r>
           <w:rPr>
             <w:rStyle w:val="Hyperlink"/>
@@ -3276,7 +3274,7 @@
             <w:noProof/>
             <w:webHidden/>
           </w:rPr>
-          <w:instrText xml:space="preserve"> PAGEREF _Toc228126994 \h </w:instrText>
+          <w:instrText xml:space="preserve"> PAGEREF _Toc228129450 \h </w:instrText>
         </w:r>
         <w:r>
           <w:rPr>
@@ -3323,7 +3321,7 @@
           <w14:ligatures w14:val="standardContextual"/>
         </w:rPr>
       </w:pPr>
-      <w:hyperlink w:anchor="_Toc228126995" w:history="1">
+      <w:hyperlink w:anchor="_Toc228129451" w:history="1">
         <w:r>
           <w:rPr>
             <w:rStyle w:val="Hyperlink"/>
@@ -3350,7 +3348,7 @@
             <w:noProof/>
             <w:webHidden/>
           </w:rPr>
-          <w:instrText xml:space="preserve"> PAGEREF _Toc228126995 \h </w:instrText>
+          <w:instrText xml:space="preserve"> PAGEREF _Toc228129451 \h </w:instrText>
         </w:r>
         <w:r>
           <w:rPr>
@@ -3395,7 +3393,7 @@
           <w14:ligatures w14:val="standardContextual"/>
         </w:rPr>
       </w:pPr>
-      <w:hyperlink w:anchor="_Toc228126996" w:history="1">
+      <w:hyperlink w:anchor="_Toc228129452" w:history="1">
         <w:r>
           <w:rPr>
             <w:rStyle w:val="Hyperlink"/>
@@ -3422,7 +3420,7 @@
             <w:noProof/>
             <w:webHidden/>
           </w:rPr>
-          <w:instrText xml:space="preserve"> PAGEREF _Toc228126996 \h </w:instrText>
+          <w:instrText xml:space="preserve"> PAGEREF _Toc228129452 \h </w:instrText>
         </w:r>
         <w:r>
           <w:rPr>
@@ -3443,6 +3441,298 @@
             <w:webHidden/>
           </w:rPr>
           <w:t>2</w:t>
+        </w:r>
+        <w:r>
+          <w:rPr>
+            <w:noProof/>
+            <w:webHidden/>
+          </w:rPr>
+          <w:fldChar w:fldCharType="end"/>
+        </w:r>
+      </w:hyperlink>
+    </w:p>
+    <w:p>
+      <w:pPr>
+        <w:pStyle w:val="TOC4"/>
+        <w:tabs>
+          <w:tab w:val="right" w:pos="9350"/>
+        </w:tabs>
+        <w:rPr>
+          <w:rFonts w:asciiTheme="minorHAnsi" w:eastAsiaTheme="minorEastAsia" w:hAnsiTheme="minorHAnsi" w:cstheme="minorBidi"/>
+          <w:noProof/>
+          <w:kern w:val="2"/>
+          <w:sz w:val="24"/>
+          <w:szCs w:val="24"/>
+          <w14:ligatures w14:val="standardContextual"/>
+        </w:rPr>
+      </w:pPr>
+      <w:hyperlink w:anchor="_Toc228129453" w:history="1">
+        <w:r>
+          <w:rPr>
+            <w:rStyle w:val="Hyperlink"/>
+            <w:noProof/>
+          </w:rPr>
+          <w:t>Quantum Data Encoding</w:t>
+        </w:r>
+        <w:r>
+          <w:rPr>
+            <w:noProof/>
+            <w:webHidden/>
+          </w:rPr>
+          <w:tab/>
+        </w:r>
+        <w:r>
+          <w:rPr>
+            <w:noProof/>
+            <w:webHidden/>
+          </w:rPr>
+          <w:fldChar w:fldCharType="begin"/>
+        </w:r>
+        <w:r>
+          <w:rPr>
+            <w:noProof/>
+            <w:webHidden/>
+          </w:rPr>
+          <w:instrText xml:space="preserve"> PAGEREF _Toc228129453 \h </w:instrText>
+        </w:r>
+        <w:r>
+          <w:rPr>
+            <w:noProof/>
+            <w:webHidden/>
+          </w:rPr>
+        </w:r>
+        <w:r>
+          <w:rPr>
+            <w:noProof/>
+            <w:webHidden/>
+          </w:rPr>
+          <w:fldChar w:fldCharType="separate"/>
+        </w:r>
+        <w:r>
+          <w:rPr>
+            <w:noProof/>
+            <w:webHidden/>
+          </w:rPr>
+          <w:t>2</w:t>
+        </w:r>
+        <w:r>
+          <w:rPr>
+            <w:noProof/>
+            <w:webHidden/>
+          </w:rPr>
+          <w:fldChar w:fldCharType="end"/>
+        </w:r>
+      </w:hyperlink>
+    </w:p>
+    <w:p>
+      <w:pPr>
+        <w:pStyle w:val="TOC4"/>
+        <w:tabs>
+          <w:tab w:val="right" w:pos="9350"/>
+        </w:tabs>
+        <w:rPr>
+          <w:rFonts w:asciiTheme="minorHAnsi" w:eastAsiaTheme="minorEastAsia" w:hAnsiTheme="minorHAnsi" w:cstheme="minorBidi"/>
+          <w:noProof/>
+          <w:kern w:val="2"/>
+          <w:sz w:val="24"/>
+          <w:szCs w:val="24"/>
+          <w14:ligatures w14:val="standardContextual"/>
+        </w:rPr>
+      </w:pPr>
+      <w:hyperlink w:anchor="_Toc228129454" w:history="1">
+        <w:r>
+          <w:rPr>
+            <w:rStyle w:val="Hyperlink"/>
+            <w:noProof/>
+          </w:rPr>
+          <w:t>Quantum Vertex Classification</w:t>
+        </w:r>
+        <w:r>
+          <w:rPr>
+            <w:noProof/>
+            <w:webHidden/>
+          </w:rPr>
+          <w:tab/>
+        </w:r>
+        <w:r>
+          <w:rPr>
+            <w:noProof/>
+            <w:webHidden/>
+          </w:rPr>
+          <w:fldChar w:fldCharType="begin"/>
+        </w:r>
+        <w:r>
+          <w:rPr>
+            <w:noProof/>
+            <w:webHidden/>
+          </w:rPr>
+          <w:instrText xml:space="preserve"> PAGEREF _Toc228129454 \h </w:instrText>
+        </w:r>
+        <w:r>
+          <w:rPr>
+            <w:noProof/>
+            <w:webHidden/>
+          </w:rPr>
+        </w:r>
+        <w:r>
+          <w:rPr>
+            <w:noProof/>
+            <w:webHidden/>
+          </w:rPr>
+          <w:fldChar w:fldCharType="separate"/>
+        </w:r>
+        <w:r>
+          <w:rPr>
+            <w:noProof/>
+            <w:webHidden/>
+          </w:rPr>
+          <w:t>3</w:t>
+        </w:r>
+        <w:r>
+          <w:rPr>
+            <w:noProof/>
+            <w:webHidden/>
+          </w:rPr>
+          <w:fldChar w:fldCharType="end"/>
+        </w:r>
+      </w:hyperlink>
+    </w:p>
+    <w:p>
+      <w:pPr>
+        <w:pStyle w:val="TOC4"/>
+        <w:tabs>
+          <w:tab w:val="right" w:pos="9350"/>
+        </w:tabs>
+        <w:rPr>
+          <w:rFonts w:asciiTheme="minorHAnsi" w:eastAsiaTheme="minorEastAsia" w:hAnsiTheme="minorHAnsi" w:cstheme="minorBidi"/>
+          <w:noProof/>
+          <w:kern w:val="2"/>
+          <w:sz w:val="24"/>
+          <w:szCs w:val="24"/>
+          <w14:ligatures w14:val="standardContextual"/>
+        </w:rPr>
+      </w:pPr>
+      <w:hyperlink w:anchor="_Toc228129455" w:history="1">
+        <w:r>
+          <w:rPr>
+            <w:rStyle w:val="Hyperlink"/>
+            <w:noProof/>
+          </w:rPr>
+          <w:t>Measurement and Readout</w:t>
+        </w:r>
+        <w:r>
+          <w:rPr>
+            <w:noProof/>
+            <w:webHidden/>
+          </w:rPr>
+          <w:tab/>
+        </w:r>
+        <w:r>
+          <w:rPr>
+            <w:noProof/>
+            <w:webHidden/>
+          </w:rPr>
+          <w:fldChar w:fldCharType="begin"/>
+        </w:r>
+        <w:r>
+          <w:rPr>
+            <w:noProof/>
+            <w:webHidden/>
+          </w:rPr>
+          <w:instrText xml:space="preserve"> PAGEREF _Toc228129455 \h </w:instrText>
+        </w:r>
+        <w:r>
+          <w:rPr>
+            <w:noProof/>
+            <w:webHidden/>
+          </w:rPr>
+        </w:r>
+        <w:r>
+          <w:rPr>
+            <w:noProof/>
+            <w:webHidden/>
+          </w:rPr>
+          <w:fldChar w:fldCharType="separate"/>
+        </w:r>
+        <w:r>
+          <w:rPr>
+            <w:noProof/>
+            <w:webHidden/>
+          </w:rPr>
+          <w:t>4</w:t>
+        </w:r>
+        <w:r>
+          <w:rPr>
+            <w:noProof/>
+            <w:webHidden/>
+          </w:rPr>
+          <w:fldChar w:fldCharType="end"/>
+        </w:r>
+      </w:hyperlink>
+    </w:p>
+    <w:p>
+      <w:pPr>
+        <w:pStyle w:val="TOC4"/>
+        <w:tabs>
+          <w:tab w:val="right" w:pos="9350"/>
+        </w:tabs>
+        <w:rPr>
+          <w:rFonts w:asciiTheme="minorHAnsi" w:eastAsiaTheme="minorEastAsia" w:hAnsiTheme="minorHAnsi" w:cstheme="minorBidi"/>
+          <w:noProof/>
+          <w:kern w:val="2"/>
+          <w:sz w:val="24"/>
+          <w:szCs w:val="24"/>
+          <w14:ligatures w14:val="standardContextual"/>
+        </w:rPr>
+      </w:pPr>
+      <w:hyperlink w:anchor="_Toc228129456" w:history="1">
+        <w:r>
+          <w:rPr>
+            <w:rStyle w:val="Hyperlink"/>
+            <w:noProof/>
+          </w:rPr>
+          <w:t>Tiling</w:t>
+        </w:r>
+        <w:r>
+          <w:rPr>
+            <w:noProof/>
+            <w:webHidden/>
+          </w:rPr>
+          <w:tab/>
+        </w:r>
+        <w:r>
+          <w:rPr>
+            <w:noProof/>
+            <w:webHidden/>
+          </w:rPr>
+          <w:fldChar w:fldCharType="begin"/>
+        </w:r>
+        <w:r>
+          <w:rPr>
+            <w:noProof/>
+            <w:webHidden/>
+          </w:rPr>
+          <w:instrText xml:space="preserve"> PAGEREF _Toc228129456 \h </w:instrText>
+        </w:r>
+        <w:r>
+          <w:rPr>
+            <w:noProof/>
+            <w:webHidden/>
+          </w:rPr>
+        </w:r>
+        <w:r>
+          <w:rPr>
+            <w:noProof/>
+            <w:webHidden/>
+          </w:rPr>
+          <w:fldChar w:fldCharType="separate"/>
+        </w:r>
+        <w:r>
+          <w:rPr>
+            <w:noProof/>
+            <w:webHidden/>
+          </w:rPr>
+          <w:t>5</w:t>
         </w:r>
         <w:r>
           <w:rPr>
@@ -3467,7 +3757,7 @@
           <w14:ligatures w14:val="standardContextual"/>
         </w:rPr>
       </w:pPr>
-      <w:hyperlink w:anchor="_Toc228126997" w:history="1">
+      <w:hyperlink w:anchor="_Toc228129457" w:history="1">
         <w:r>
           <w:rPr>
             <w:rStyle w:val="Hyperlink"/>
@@ -3494,7 +3784,7 @@
             <w:noProof/>
             <w:webHidden/>
           </w:rPr>
-          <w:instrText xml:space="preserve"> PAGEREF _Toc228126997 \h </w:instrText>
+          <w:instrText xml:space="preserve"> PAGEREF _Toc228129457 \h </w:instrText>
         </w:r>
         <w:r>
           <w:rPr>
@@ -3514,7 +3804,80 @@
             <w:noProof/>
             <w:webHidden/>
           </w:rPr>
-          <w:t>2</w:t>
+          <w:t>6</w:t>
+        </w:r>
+        <w:r>
+          <w:rPr>
+            <w:noProof/>
+            <w:webHidden/>
+          </w:rPr>
+          <w:fldChar w:fldCharType="end"/>
+        </w:r>
+      </w:hyperlink>
+    </w:p>
+    <w:p>
+      <w:pPr>
+        <w:pStyle w:val="TOC4"/>
+        <w:tabs>
+          <w:tab w:val="right" w:pos="9350"/>
+        </w:tabs>
+        <w:rPr>
+          <w:rFonts w:asciiTheme="minorHAnsi" w:eastAsiaTheme="minorEastAsia" w:hAnsiTheme="minorHAnsi" w:cstheme="minorBidi"/>
+          <w:noProof/>
+          <w:kern w:val="2"/>
+          <w:sz w:val="24"/>
+          <w:szCs w:val="24"/>
+          <w14:ligatures w14:val="standardContextual"/>
+        </w:rPr>
+      </w:pPr>
+      <w:hyperlink w:anchor="_Toc228129458" w:history="1">
+        <w:r>
+          <w:rPr>
+            <w:rStyle w:val="Hyperlink"/>
+            <w:noProof/>
+          </w:rPr>
+          <w:t>EHands Weighted Summation</w:t>
+        </w:r>
+        <w:r>
+          <w:rPr>
+            <w:noProof/>
+            <w:webHidden/>
+          </w:rPr>
+          <w:tab/>
+        </w:r>
+        <w:r>
+          <w:rPr>
+            <w:noProof/>
+            <w:webHidden/>
+          </w:rPr>
+          <w:fldChar w:fldCharType="begin"/>
+        </w:r>
+        <w:r>
+          <w:rPr>
+            <w:noProof/>
+            <w:webHidden/>
+          </w:rPr>
+          <w:instrText xml:space="preserve"> PAGEREF _Toc228129458 \h </w:instrText>
+        </w:r>
+        <w:r>
+          <w:rPr>
+            <w:noProof/>
+            <w:webHidden/>
+          </w:rPr>
+        </w:r>
+        <w:r>
+          <w:rPr>
+            <w:noProof/>
+            <w:webHidden/>
+          </w:rPr>
+          <w:fldChar w:fldCharType="separate"/>
+        </w:r>
+        <w:r>
+          <w:rPr>
+            <w:noProof/>
+            <w:webHidden/>
+          </w:rPr>
+          <w:t>6</w:t>
         </w:r>
         <w:r>
           <w:rPr>
@@ -3539,7 +3902,7 @@
           <w14:ligatures w14:val="standardContextual"/>
         </w:rPr>
       </w:pPr>
-      <w:hyperlink w:anchor="_Toc228126998" w:history="1">
+      <w:hyperlink w:anchor="_Toc228129459" w:history="1">
         <w:r>
           <w:rPr>
             <w:rStyle w:val="Hyperlink"/>
@@ -3566,7 +3929,7 @@
             <w:noProof/>
             <w:webHidden/>
           </w:rPr>
-          <w:instrText xml:space="preserve"> PAGEREF _Toc228126998 \h </w:instrText>
+          <w:instrText xml:space="preserve"> PAGEREF _Toc228129459 \h </w:instrText>
         </w:r>
         <w:r>
           <w:rPr>
@@ -3586,7 +3949,7 @@
             <w:noProof/>
             <w:webHidden/>
           </w:rPr>
-          <w:t>2</w:t>
+          <w:t>6</w:t>
         </w:r>
         <w:r>
           <w:rPr>
@@ -3613,7 +3976,7 @@
           <w14:ligatures w14:val="standardContextual"/>
         </w:rPr>
       </w:pPr>
-      <w:hyperlink w:anchor="_Toc228126999" w:history="1">
+      <w:hyperlink w:anchor="_Toc228129460" w:history="1">
         <w:r>
           <w:rPr>
             <w:rStyle w:val="Hyperlink"/>
@@ -3640,7 +4003,7 @@
             <w:noProof/>
             <w:webHidden/>
           </w:rPr>
-          <w:instrText xml:space="preserve"> PAGEREF _Toc228126999 \h </w:instrText>
+          <w:instrText xml:space="preserve"> PAGEREF _Toc228129460 \h </w:instrText>
         </w:r>
         <w:r>
           <w:rPr>
@@ -3660,7 +4023,7 @@
             <w:noProof/>
             <w:webHidden/>
           </w:rPr>
-          <w:t>3</w:t>
+          <w:t>7</w:t>
         </w:r>
         <w:r>
           <w:rPr>
@@ -3685,7 +4048,7 @@
           <w14:ligatures w14:val="standardContextual"/>
         </w:rPr>
       </w:pPr>
-      <w:hyperlink w:anchor="_Toc228127000" w:history="1">
+      <w:hyperlink w:anchor="_Toc228129461" w:history="1">
         <w:r>
           <w:rPr>
             <w:rStyle w:val="Hyperlink"/>
@@ -3712,7 +4075,7 @@
             <w:noProof/>
             <w:webHidden/>
           </w:rPr>
-          <w:instrText xml:space="preserve"> PAGEREF _Toc228127000 \h </w:instrText>
+          <w:instrText xml:space="preserve"> PAGEREF _Toc228129461 \h </w:instrText>
         </w:r>
         <w:r>
           <w:rPr>
@@ -3732,7 +4095,7 @@
             <w:noProof/>
             <w:webHidden/>
           </w:rPr>
-          <w:t>3</w:t>
+          <w:t>7</w:t>
         </w:r>
         <w:r>
           <w:rPr>
@@ -3757,7 +4120,7 @@
           <w14:ligatures w14:val="standardContextual"/>
         </w:rPr>
       </w:pPr>
-      <w:hyperlink w:anchor="_Toc228127001" w:history="1">
+      <w:hyperlink w:anchor="_Toc228129462" w:history="1">
         <w:r>
           <w:rPr>
             <w:rStyle w:val="Hyperlink"/>
@@ -3784,7 +4147,7 @@
             <w:noProof/>
             <w:webHidden/>
           </w:rPr>
-          <w:instrText xml:space="preserve"> PAGEREF _Toc228127001 \h </w:instrText>
+          <w:instrText xml:space="preserve"> PAGEREF _Toc228129462 \h </w:instrText>
         </w:r>
         <w:r>
           <w:rPr>
@@ -3804,7 +4167,7 @@
             <w:noProof/>
             <w:webHidden/>
           </w:rPr>
-          <w:t>3</w:t>
+          <w:t>7</w:t>
         </w:r>
         <w:r>
           <w:rPr>
@@ -3829,7 +4192,7 @@
           <w14:ligatures w14:val="standardContextual"/>
         </w:rPr>
       </w:pPr>
-      <w:hyperlink w:anchor="_Toc228127002" w:history="1">
+      <w:hyperlink w:anchor="_Toc228129463" w:history="1">
         <w:r>
           <w:rPr>
             <w:rStyle w:val="Hyperlink"/>
@@ -3856,7 +4219,7 @@
             <w:noProof/>
             <w:webHidden/>
           </w:rPr>
-          <w:instrText xml:space="preserve"> PAGEREF _Toc228127002 \h </w:instrText>
+          <w:instrText xml:space="preserve"> PAGEREF _Toc228129463 \h </w:instrText>
         </w:r>
         <w:r>
           <w:rPr>
@@ -3876,7 +4239,7 @@
             <w:noProof/>
             <w:webHidden/>
           </w:rPr>
-          <w:t>3</w:t>
+          <w:t>7</w:t>
         </w:r>
         <w:r>
           <w:rPr>
@@ -3901,7 +4264,7 @@
           <w14:ligatures w14:val="standardContextual"/>
         </w:rPr>
       </w:pPr>
-      <w:hyperlink w:anchor="_Toc228127003" w:history="1">
+      <w:hyperlink w:anchor="_Toc228129464" w:history="1">
         <w:r>
           <w:rPr>
             <w:rStyle w:val="Hyperlink"/>
@@ -3928,7 +4291,7 @@
             <w:noProof/>
             <w:webHidden/>
           </w:rPr>
-          <w:instrText xml:space="preserve"> PAGEREF _Toc228127003 \h </w:instrText>
+          <w:instrText xml:space="preserve"> PAGEREF _Toc228129464 \h </w:instrText>
         </w:r>
         <w:r>
           <w:rPr>
@@ -3948,7 +4311,7 @@
             <w:noProof/>
             <w:webHidden/>
           </w:rPr>
-          <w:t>3</w:t>
+          <w:t>7</w:t>
         </w:r>
         <w:r>
           <w:rPr>
@@ -3973,7 +4336,7 @@
           <w14:ligatures w14:val="standardContextual"/>
         </w:rPr>
       </w:pPr>
-      <w:hyperlink w:anchor="_Toc228127004" w:history="1">
+      <w:hyperlink w:anchor="_Toc228129465" w:history="1">
         <w:r>
           <w:rPr>
             <w:rStyle w:val="Hyperlink"/>
@@ -4000,7 +4363,7 @@
             <w:noProof/>
             <w:webHidden/>
           </w:rPr>
-          <w:instrText xml:space="preserve"> PAGEREF _Toc228127004 \h </w:instrText>
+          <w:instrText xml:space="preserve"> PAGEREF _Toc228129465 \h </w:instrText>
         </w:r>
         <w:r>
           <w:rPr>
@@ -4020,7 +4383,7 @@
             <w:noProof/>
             <w:webHidden/>
           </w:rPr>
-          <w:t>3</w:t>
+          <w:t>7</w:t>
         </w:r>
         <w:r>
           <w:rPr>
@@ -4045,7 +4408,7 @@
           <w14:ligatures w14:val="standardContextual"/>
         </w:rPr>
       </w:pPr>
-      <w:hyperlink w:anchor="_Toc228127005" w:history="1">
+      <w:hyperlink w:anchor="_Toc228129466" w:history="1">
         <w:r>
           <w:rPr>
             <w:rStyle w:val="Hyperlink"/>
@@ -4072,7 +4435,7 @@
             <w:noProof/>
             <w:webHidden/>
           </w:rPr>
-          <w:instrText xml:space="preserve"> PAGEREF _Toc228127005 \h </w:instrText>
+          <w:instrText xml:space="preserve"> PAGEREF _Toc228129466 \h </w:instrText>
         </w:r>
         <w:r>
           <w:rPr>
@@ -4092,7 +4455,7 @@
             <w:noProof/>
             <w:webHidden/>
           </w:rPr>
-          <w:t>3</w:t>
+          <w:t>7</w:t>
         </w:r>
         <w:r>
           <w:rPr>
@@ -4117,7 +4480,7 @@
           <w14:ligatures w14:val="standardContextual"/>
         </w:rPr>
       </w:pPr>
-      <w:hyperlink w:anchor="_Toc228127006" w:history="1">
+      <w:hyperlink w:anchor="_Toc228129467" w:history="1">
         <w:r>
           <w:rPr>
             <w:rStyle w:val="Hyperlink"/>
@@ -4144,7 +4507,7 @@
             <w:noProof/>
             <w:webHidden/>
           </w:rPr>
-          <w:instrText xml:space="preserve"> PAGEREF _Toc228127006 \h </w:instrText>
+          <w:instrText xml:space="preserve"> PAGEREF _Toc228129467 \h </w:instrText>
         </w:r>
         <w:r>
           <w:rPr>
@@ -4164,7 +4527,7 @@
             <w:noProof/>
             <w:webHidden/>
           </w:rPr>
-          <w:t>3</w:t>
+          <w:t>7</w:t>
         </w:r>
         <w:r>
           <w:rPr>
@@ -4189,7 +4552,7 @@
           <w14:ligatures w14:val="standardContextual"/>
         </w:rPr>
       </w:pPr>
-      <w:hyperlink w:anchor="_Toc228127007" w:history="1">
+      <w:hyperlink w:anchor="_Toc228129468" w:history="1">
         <w:r>
           <w:rPr>
             <w:rStyle w:val="Hyperlink"/>
@@ -4216,7 +4579,7 @@
             <w:noProof/>
             <w:webHidden/>
           </w:rPr>
-          <w:instrText xml:space="preserve"> PAGEREF _Toc228127007 \h </w:instrText>
+          <w:instrText xml:space="preserve"> PAGEREF _Toc228129468 \h </w:instrText>
         </w:r>
         <w:r>
           <w:rPr>
@@ -4236,7 +4599,7 @@
             <w:noProof/>
             <w:webHidden/>
           </w:rPr>
-          <w:t>3</w:t>
+          <w:t>7</w:t>
         </w:r>
         <w:r>
           <w:rPr>
@@ -4263,7 +4626,7 @@
           <w14:ligatures w14:val="standardContextual"/>
         </w:rPr>
       </w:pPr>
-      <w:hyperlink w:anchor="_Toc228127008" w:history="1">
+      <w:hyperlink w:anchor="_Toc228129469" w:history="1">
         <w:r>
           <w:rPr>
             <w:rStyle w:val="Hyperlink"/>
@@ -4290,7 +4653,7 @@
             <w:noProof/>
             <w:webHidden/>
           </w:rPr>
-          <w:instrText xml:space="preserve"> PAGEREF _Toc228127008 \h </w:instrText>
+          <w:instrText xml:space="preserve"> PAGEREF _Toc228129469 \h </w:instrText>
         </w:r>
         <w:r>
           <w:rPr>
@@ -4310,7 +4673,7 @@
             <w:noProof/>
             <w:webHidden/>
           </w:rPr>
-          <w:t>4</w:t>
+          <w:t>8</w:t>
         </w:r>
         <w:r>
           <w:rPr>
@@ -4337,7 +4700,7 @@
           <w14:ligatures w14:val="standardContextual"/>
         </w:rPr>
       </w:pPr>
-      <w:hyperlink w:anchor="_Toc228127009" w:history="1">
+      <w:hyperlink w:anchor="_Toc228129470" w:history="1">
         <w:r>
           <w:rPr>
             <w:rStyle w:val="Hyperlink"/>
@@ -4364,7 +4727,7 @@
             <w:noProof/>
             <w:webHidden/>
           </w:rPr>
-          <w:instrText xml:space="preserve"> PAGEREF _Toc228127009 \h </w:instrText>
+          <w:instrText xml:space="preserve"> PAGEREF _Toc228129470 \h </w:instrText>
         </w:r>
         <w:r>
           <w:rPr>
@@ -4384,7 +4747,7 @@
             <w:noProof/>
             <w:webHidden/>
           </w:rPr>
-          <w:t>5</w:t>
+          <w:t>9</w:t>
         </w:r>
         <w:r>
           <w:rPr>
@@ -4409,7 +4772,7 @@
           <w14:ligatures w14:val="standardContextual"/>
         </w:rPr>
       </w:pPr>
-      <w:hyperlink w:anchor="_Toc228127010" w:history="1">
+      <w:hyperlink w:anchor="_Toc228129471" w:history="1">
         <w:r>
           <w:rPr>
             <w:rStyle w:val="Hyperlink"/>
@@ -4436,7 +4799,7 @@
             <w:noProof/>
             <w:webHidden/>
           </w:rPr>
-          <w:instrText xml:space="preserve"> PAGEREF _Toc228127010 \h </w:instrText>
+          <w:instrText xml:space="preserve"> PAGEREF _Toc228129471 \h </w:instrText>
         </w:r>
         <w:r>
           <w:rPr>
@@ -4456,7 +4819,7 @@
             <w:noProof/>
             <w:webHidden/>
           </w:rPr>
-          <w:t>5</w:t>
+          <w:t>9</w:t>
         </w:r>
         <w:r>
           <w:rPr>
@@ -4482,7 +4845,7 @@
           <w14:ligatures w14:val="standardContextual"/>
         </w:rPr>
       </w:pPr>
-      <w:hyperlink w:anchor="_Toc228127011" w:history="1">
+      <w:hyperlink w:anchor="_Toc228129472" w:history="1">
         <w:r>
           <w:rPr>
             <w:rStyle w:val="Hyperlink"/>
@@ -4509,7 +4872,7 @@
             <w:noProof/>
             <w:webHidden/>
           </w:rPr>
-          <w:instrText xml:space="preserve"> PAGEREF _Toc228127011 \h </w:instrText>
+          <w:instrText xml:space="preserve"> PAGEREF _Toc228129472 \h </w:instrText>
         </w:r>
         <w:r>
           <w:rPr>
@@ -4529,7 +4892,7 @@
             <w:noProof/>
             <w:webHidden/>
           </w:rPr>
-          <w:t>7</w:t>
+          <w:t>11</w:t>
         </w:r>
         <w:r>
           <w:rPr>
@@ -4556,7 +4919,7 @@
           <w14:ligatures w14:val="standardContextual"/>
         </w:rPr>
       </w:pPr>
-      <w:hyperlink w:anchor="_Toc228127012" w:history="1">
+      <w:hyperlink w:anchor="_Toc228129473" w:history="1">
         <w:r>
           <w:rPr>
             <w:rStyle w:val="Hyperlink"/>
@@ -4583,7 +4946,7 @@
             <w:noProof/>
             <w:webHidden/>
           </w:rPr>
-          <w:instrText xml:space="preserve"> PAGEREF _Toc228127012 \h </w:instrText>
+          <w:instrText xml:space="preserve"> PAGEREF _Toc228129473 \h </w:instrText>
         </w:r>
         <w:r>
           <w:rPr>
@@ -4603,7 +4966,7 @@
             <w:noProof/>
             <w:webHidden/>
           </w:rPr>
-          <w:t>9</w:t>
+          <w:t>13</w:t>
         </w:r>
         <w:r>
           <w:rPr>
@@ -4630,7 +4993,7 @@
           <w14:ligatures w14:val="standardContextual"/>
         </w:rPr>
       </w:pPr>
-      <w:hyperlink w:anchor="_Toc228127013" w:history="1">
+      <w:hyperlink w:anchor="_Toc228129474" w:history="1">
         <w:r>
           <w:rPr>
             <w:rStyle w:val="Hyperlink"/>
@@ -4657,7 +5020,7 @@
             <w:noProof/>
             <w:webHidden/>
           </w:rPr>
-          <w:instrText xml:space="preserve"> PAGEREF _Toc228127013 \h </w:instrText>
+          <w:instrText xml:space="preserve"> PAGEREF _Toc228129474 \h </w:instrText>
         </w:r>
         <w:r>
           <w:rPr>
@@ -4677,7 +5040,7 @@
             <w:noProof/>
             <w:webHidden/>
           </w:rPr>
-          <w:t>10</w:t>
+          <w:t>14</w:t>
         </w:r>
         <w:r>
           <w:rPr>
@@ -4741,7 +5104,7 @@
       <w:pPr>
         <w:pStyle w:val="Heading2"/>
       </w:pPr>
-      <w:bookmarkStart w:id="63" w:name="_Toc228126983"/>
+      <w:bookmarkStart w:id="63" w:name="_Toc228129439"/>
       <w:commentRangeStart w:id="64"/>
       <w:commentRangeStart w:id="65"/>
       <w:r>
@@ -5005,7 +5368,7 @@
       </w:r>
       <w:bookmarkStart w:id="67" w:name="_Toc358019865"/>
       <w:bookmarkStart w:id="68" w:name="_Toc358026763"/>
-      <w:bookmarkStart w:id="69" w:name="_Toc228126984"/>
+      <w:bookmarkStart w:id="69" w:name="_Toc228129440"/>
       <w:commentRangeStart w:id="70"/>
       <w:commentRangeStart w:id="71"/>
       <w:r>
@@ -5278,7 +5641,7 @@
       </w:pPr>
       <w:bookmarkStart w:id="73" w:name="_Toc358019866"/>
       <w:bookmarkStart w:id="74" w:name="_Toc358026764"/>
-      <w:bookmarkStart w:id="75" w:name="_Toc228126985"/>
+      <w:bookmarkStart w:id="75" w:name="_Toc228129441"/>
       <w:commentRangeStart w:id="76"/>
       <w:commentRangeStart w:id="77"/>
       <w:r>
@@ -5547,7 +5910,7 @@
       <w:pPr>
         <w:pStyle w:val="Heading2"/>
       </w:pPr>
-      <w:bookmarkStart w:id="79" w:name="_Toc228126986"/>
+      <w:bookmarkStart w:id="79" w:name="_Toc228129442"/>
       <w:r>
         <w:rPr>
           <w:rStyle w:val="CommentReference"/>
@@ -5596,183 +5959,7 @@
         <w:commentReference w:id="82"/>
       </w:r>
       <w:r>
-        <w:t xml:space="preserve">orem ipsum dolor sit </w:t>
-      </w:r>
-      <w:proofErr w:type="spellStart"/>
-      <w:r>
-        <w:t>amet</w:t>
-      </w:r>
-      <w:proofErr w:type="spellEnd"/>
-      <w:r>
-        <w:t xml:space="preserve">, </w:t>
-      </w:r>
-      <w:proofErr w:type="spellStart"/>
-      <w:r>
-        <w:t>consectetuer</w:t>
-      </w:r>
-      <w:proofErr w:type="spellEnd"/>
-      <w:r>
-        <w:t xml:space="preserve"> </w:t>
-      </w:r>
-      <w:proofErr w:type="spellStart"/>
-      <w:r>
-        <w:t>adipiscing</w:t>
-      </w:r>
-      <w:proofErr w:type="spellEnd"/>
-      <w:r>
-        <w:t xml:space="preserve"> </w:t>
-      </w:r>
-      <w:proofErr w:type="spellStart"/>
-      <w:r>
-        <w:t>elit</w:t>
-      </w:r>
-      <w:proofErr w:type="spellEnd"/>
-      <w:r>
-        <w:t xml:space="preserve">. Maecenas </w:t>
-      </w:r>
-      <w:proofErr w:type="spellStart"/>
-      <w:r>
-        <w:t>porttitor</w:t>
-      </w:r>
-      <w:proofErr w:type="spellEnd"/>
-      <w:r>
-        <w:t xml:space="preserve"> </w:t>
-      </w:r>
-      <w:proofErr w:type="spellStart"/>
-      <w:r>
-        <w:t>congue</w:t>
-      </w:r>
-      <w:proofErr w:type="spellEnd"/>
-      <w:r>
-        <w:t xml:space="preserve"> </w:t>
-      </w:r>
-      <w:proofErr w:type="spellStart"/>
-      <w:r>
-        <w:t>massa</w:t>
-      </w:r>
-      <w:proofErr w:type="spellEnd"/>
-      <w:r>
-        <w:t xml:space="preserve">. </w:t>
-      </w:r>
-      <w:proofErr w:type="spellStart"/>
-      <w:r>
-        <w:t>Fusce</w:t>
-      </w:r>
-      <w:proofErr w:type="spellEnd"/>
-      <w:r>
-        <w:t xml:space="preserve"> </w:t>
-      </w:r>
-      <w:proofErr w:type="spellStart"/>
-      <w:r>
-        <w:t>posuere</w:t>
-      </w:r>
-      <w:proofErr w:type="spellEnd"/>
-      <w:r>
-        <w:t xml:space="preserve">, magna sed pulvinar </w:t>
-      </w:r>
-      <w:proofErr w:type="spellStart"/>
-      <w:r>
-        <w:t>ultricies</w:t>
-      </w:r>
-      <w:proofErr w:type="spellEnd"/>
-      <w:r>
-        <w:t xml:space="preserve">, </w:t>
-      </w:r>
-      <w:proofErr w:type="spellStart"/>
-      <w:r>
-        <w:t>purus</w:t>
-      </w:r>
-      <w:proofErr w:type="spellEnd"/>
-      <w:r>
-        <w:t xml:space="preserve"> </w:t>
-      </w:r>
-      <w:proofErr w:type="spellStart"/>
-      <w:r>
-        <w:t>lectus</w:t>
-      </w:r>
-      <w:proofErr w:type="spellEnd"/>
-      <w:r>
-        <w:t xml:space="preserve"> </w:t>
-      </w:r>
-      <w:proofErr w:type="spellStart"/>
-      <w:r>
-        <w:t>malesuada</w:t>
-      </w:r>
-      <w:proofErr w:type="spellEnd"/>
-      <w:r>
-        <w:t xml:space="preserve"> libero, sit </w:t>
-      </w:r>
-      <w:proofErr w:type="spellStart"/>
-      <w:r>
-        <w:t>amet</w:t>
-      </w:r>
-      <w:proofErr w:type="spellEnd"/>
-      <w:r>
-        <w:t xml:space="preserve"> </w:t>
-      </w:r>
-      <w:proofErr w:type="spellStart"/>
-      <w:r>
-        <w:t>commodo</w:t>
-      </w:r>
-      <w:proofErr w:type="spellEnd"/>
-      <w:r>
-        <w:t xml:space="preserve"> magna eros quis </w:t>
-      </w:r>
-      <w:proofErr w:type="spellStart"/>
-      <w:r>
-        <w:t>urna</w:t>
-      </w:r>
-      <w:proofErr w:type="spellEnd"/>
-      <w:r>
-        <w:t xml:space="preserve">. Nunc </w:t>
-      </w:r>
-      <w:proofErr w:type="spellStart"/>
-      <w:r>
-        <w:t>viverra</w:t>
-      </w:r>
-      <w:proofErr w:type="spellEnd"/>
-      <w:r>
-        <w:t xml:space="preserve"> </w:t>
-      </w:r>
-      <w:proofErr w:type="spellStart"/>
-      <w:r>
-        <w:t>imperdiet</w:t>
-      </w:r>
-      <w:proofErr w:type="spellEnd"/>
-      <w:r>
-        <w:t xml:space="preserve"> </w:t>
-      </w:r>
-      <w:proofErr w:type="spellStart"/>
-      <w:r>
-        <w:t>enim</w:t>
-      </w:r>
-      <w:proofErr w:type="spellEnd"/>
-      <w:r>
-        <w:t xml:space="preserve">. </w:t>
-      </w:r>
-      <w:proofErr w:type="spellStart"/>
-      <w:r>
-        <w:t>Fusce</w:t>
-      </w:r>
-      <w:proofErr w:type="spellEnd"/>
-      <w:r>
-        <w:t xml:space="preserve"> est. </w:t>
-      </w:r>
-      <w:proofErr w:type="spellStart"/>
-      <w:r>
-        <w:t>Vivamus</w:t>
-      </w:r>
-      <w:proofErr w:type="spellEnd"/>
-      <w:r>
-        <w:t xml:space="preserve"> a </w:t>
-      </w:r>
-      <w:proofErr w:type="spellStart"/>
-      <w:r>
-        <w:t>tellus</w:t>
-      </w:r>
-      <w:proofErr w:type="spellEnd"/>
-      <w:r>
-        <w:t>.</w:t>
+        <w:t>orem ipsum dolor sit amet, consectetuer adipiscing elit. Maecenas porttitor congue massa. Fusce posuere, magna sed pulvinar ultricies, purus lectus malesuada libero, sit amet commodo magna eros quis urna. Nunc viverra imperdiet enim. Fusce est. Vivamus a tellus.</w:t>
       </w:r>
       <w:r>
         <w:br w:type="page"/>
@@ -5786,7 +5973,7 @@
           <w:shd w:val="clear" w:color="auto" w:fill="FFFFFF"/>
         </w:rPr>
       </w:pPr>
-      <w:bookmarkStart w:id="83" w:name="_Toc228126987"/>
+      <w:bookmarkStart w:id="83" w:name="_Toc228129443"/>
       <w:commentRangeStart w:id="84"/>
       <w:r>
         <w:lastRenderedPageBreak/>
@@ -5810,7 +5997,7 @@
       <w:pPr>
         <w:pStyle w:val="Heading3"/>
       </w:pPr>
-      <w:bookmarkStart w:id="85" w:name="_Toc228126988"/>
+      <w:bookmarkStart w:id="85" w:name="_Toc228129444"/>
       <w:r>
         <w:t>1.1 Vertex Classification</w:t>
       </w:r>
@@ -5820,448 +6007,17 @@
       <w:pPr>
         <w:pStyle w:val="Body"/>
       </w:pPr>
-      <w:proofErr w:type="spellStart"/>
-      <w:r>
-        <w:t>Pellentesque</w:t>
-      </w:r>
-      <w:proofErr w:type="spellEnd"/>
-      <w:r>
-        <w:t xml:space="preserve"> </w:t>
-      </w:r>
-      <w:proofErr w:type="spellStart"/>
-      <w:r>
-        <w:t>porttitor</w:t>
-      </w:r>
-      <w:proofErr w:type="spellEnd"/>
-      <w:r>
-        <w:t xml:space="preserve">, </w:t>
-      </w:r>
-      <w:proofErr w:type="spellStart"/>
-      <w:r>
-        <w:t>velit</w:t>
-      </w:r>
-      <w:proofErr w:type="spellEnd"/>
-      <w:r>
-        <w:t xml:space="preserve"> lacinia </w:t>
-      </w:r>
-      <w:proofErr w:type="spellStart"/>
-      <w:r>
-        <w:t>egestas</w:t>
-      </w:r>
-      <w:proofErr w:type="spellEnd"/>
-      <w:r>
-        <w:t xml:space="preserve"> auctor, diam eros tempus </w:t>
-      </w:r>
-      <w:proofErr w:type="spellStart"/>
-      <w:r>
-        <w:t>arcu</w:t>
-      </w:r>
-      <w:proofErr w:type="spellEnd"/>
-      <w:r>
-        <w:t xml:space="preserve">, nec </w:t>
-      </w:r>
-      <w:proofErr w:type="spellStart"/>
-      <w:r>
-        <w:t>vulputate</w:t>
-      </w:r>
-      <w:proofErr w:type="spellEnd"/>
-      <w:r>
-        <w:t xml:space="preserve"> </w:t>
-      </w:r>
-      <w:proofErr w:type="spellStart"/>
-      <w:r>
-        <w:t>augue</w:t>
-      </w:r>
-      <w:proofErr w:type="spellEnd"/>
-      <w:r>
-        <w:t xml:space="preserve"> magna vel </w:t>
-      </w:r>
-      <w:proofErr w:type="spellStart"/>
-      <w:r>
-        <w:t>risus</w:t>
-      </w:r>
-      <w:proofErr w:type="spellEnd"/>
-      <w:r>
-        <w:t xml:space="preserve">. Cras non magna vel ante </w:t>
-      </w:r>
-      <w:proofErr w:type="spellStart"/>
-      <w:r>
-        <w:t>adipiscing</w:t>
-      </w:r>
-      <w:proofErr w:type="spellEnd"/>
-      <w:r>
-        <w:t xml:space="preserve"> </w:t>
-      </w:r>
-      <w:proofErr w:type="spellStart"/>
-      <w:r>
-        <w:t>rhoncus</w:t>
-      </w:r>
-      <w:proofErr w:type="spellEnd"/>
-      <w:r>
-        <w:t xml:space="preserve">. </w:t>
-      </w:r>
-      <w:proofErr w:type="spellStart"/>
-      <w:r>
-        <w:t>Vivamus</w:t>
-      </w:r>
-      <w:proofErr w:type="spellEnd"/>
-      <w:r>
-        <w:t xml:space="preserve"> a mi. Morbi </w:t>
-      </w:r>
-      <w:proofErr w:type="spellStart"/>
-      <w:r>
-        <w:t>neque</w:t>
-      </w:r>
-      <w:proofErr w:type="spellEnd"/>
-      <w:r>
-        <w:t xml:space="preserve">. </w:t>
-      </w:r>
-      <w:proofErr w:type="spellStart"/>
-      <w:r>
-        <w:t>Aliquam</w:t>
-      </w:r>
-      <w:proofErr w:type="spellEnd"/>
-      <w:r>
-        <w:t xml:space="preserve"> </w:t>
-      </w:r>
-      <w:proofErr w:type="spellStart"/>
-      <w:r>
-        <w:t>erat</w:t>
-      </w:r>
-      <w:proofErr w:type="spellEnd"/>
-      <w:r>
-        <w:t xml:space="preserve"> </w:t>
-      </w:r>
-      <w:proofErr w:type="spellStart"/>
-      <w:r>
-        <w:t>volutpat</w:t>
-      </w:r>
-      <w:proofErr w:type="spellEnd"/>
-      <w:r>
-        <w:t xml:space="preserve">. Integer </w:t>
-      </w:r>
-      <w:proofErr w:type="spellStart"/>
-      <w:r>
-        <w:t>ultrices</w:t>
-      </w:r>
-      <w:proofErr w:type="spellEnd"/>
-      <w:r>
-        <w:t xml:space="preserve"> </w:t>
-      </w:r>
-      <w:proofErr w:type="spellStart"/>
-      <w:r>
-        <w:t>lobortis</w:t>
-      </w:r>
-      <w:proofErr w:type="spellEnd"/>
-      <w:r>
-        <w:t xml:space="preserve"> eros.</w:t>
+      <w:r>
+        <w:t>Pellentesque porttitor, velit lacinia egestas auctor, diam eros tempus arcu, nec vulputate augue magna vel risus. Cras non magna vel ante adipiscing rhoncus. Vivamus a mi. Morbi neque. Aliquam erat volutpat. Integer ultrices lobortis eros.</w:t>
       </w:r>
     </w:p>
     <w:p>
       <w:pPr>
         <w:pStyle w:val="Body"/>
       </w:pPr>
-      <w:proofErr w:type="spellStart"/>
-      <w:r>
-        <w:t>Pellentesque</w:t>
-      </w:r>
-      <w:proofErr w:type="spellEnd"/>
-      <w:r>
-        <w:t xml:space="preserve"> habitant </w:t>
-      </w:r>
-      <w:proofErr w:type="spellStart"/>
-      <w:r>
-        <w:t>morbi</w:t>
-      </w:r>
-      <w:proofErr w:type="spellEnd"/>
-      <w:r>
-        <w:t xml:space="preserve"> </w:t>
-      </w:r>
-      <w:proofErr w:type="spellStart"/>
-      <w:r>
-        <w:t>tristique</w:t>
-      </w:r>
-      <w:proofErr w:type="spellEnd"/>
-      <w:r>
-        <w:t xml:space="preserve"> </w:t>
-      </w:r>
-      <w:proofErr w:type="spellStart"/>
-      <w:r>
-        <w:t>senectus</w:t>
-      </w:r>
-      <w:proofErr w:type="spellEnd"/>
-      <w:r>
-        <w:t xml:space="preserve"> et </w:t>
-      </w:r>
-      <w:proofErr w:type="spellStart"/>
-      <w:r>
-        <w:t>netus</w:t>
-      </w:r>
-      <w:proofErr w:type="spellEnd"/>
-      <w:r>
-        <w:t xml:space="preserve"> et </w:t>
-      </w:r>
-      <w:proofErr w:type="spellStart"/>
-      <w:r>
-        <w:t>malesuada</w:t>
-      </w:r>
-      <w:proofErr w:type="spellEnd"/>
-      <w:r>
-        <w:t xml:space="preserve"> fames ac </w:t>
-      </w:r>
-      <w:proofErr w:type="spellStart"/>
-      <w:r>
-        <w:t>turpis</w:t>
-      </w:r>
-      <w:proofErr w:type="spellEnd"/>
-      <w:r>
-        <w:t xml:space="preserve"> </w:t>
-      </w:r>
-      <w:proofErr w:type="spellStart"/>
-      <w:r>
-        <w:t>egestas</w:t>
-      </w:r>
-      <w:proofErr w:type="spellEnd"/>
-      <w:r>
-        <w:t xml:space="preserve">. Proin semper, ante vitae </w:t>
-      </w:r>
-      <w:proofErr w:type="spellStart"/>
-      <w:r>
-        <w:t>sollicitudin</w:t>
-      </w:r>
-      <w:proofErr w:type="spellEnd"/>
-      <w:r>
-        <w:t xml:space="preserve"> </w:t>
-      </w:r>
-      <w:proofErr w:type="spellStart"/>
-      <w:r>
-        <w:t>posuere</w:t>
-      </w:r>
-      <w:proofErr w:type="spellEnd"/>
-      <w:r>
-        <w:t xml:space="preserve">, </w:t>
-      </w:r>
-      <w:proofErr w:type="spellStart"/>
-      <w:r>
-        <w:t>metus</w:t>
-      </w:r>
-      <w:proofErr w:type="spellEnd"/>
-      <w:r>
-        <w:t xml:space="preserve"> </w:t>
-      </w:r>
-      <w:proofErr w:type="spellStart"/>
-      <w:r>
-        <w:t>quam</w:t>
-      </w:r>
-      <w:proofErr w:type="spellEnd"/>
-      <w:r>
-        <w:t xml:space="preserve"> </w:t>
-      </w:r>
-      <w:proofErr w:type="spellStart"/>
-      <w:r>
-        <w:t>iaculis</w:t>
-      </w:r>
-      <w:proofErr w:type="spellEnd"/>
-      <w:r>
-        <w:t xml:space="preserve"> </w:t>
-      </w:r>
-      <w:proofErr w:type="spellStart"/>
-      <w:r>
-        <w:t>nibh</w:t>
-      </w:r>
-      <w:proofErr w:type="spellEnd"/>
-      <w:r>
-        <w:t xml:space="preserve">, vitae </w:t>
-      </w:r>
-      <w:proofErr w:type="spellStart"/>
-      <w:r>
-        <w:t>scelerisque</w:t>
-      </w:r>
-      <w:proofErr w:type="spellEnd"/>
-      <w:r>
-        <w:t xml:space="preserve"> nunc </w:t>
-      </w:r>
-      <w:proofErr w:type="spellStart"/>
-      <w:r>
-        <w:t>massa</w:t>
-      </w:r>
-      <w:proofErr w:type="spellEnd"/>
-      <w:r>
-        <w:t xml:space="preserve"> </w:t>
-      </w:r>
-      <w:proofErr w:type="spellStart"/>
-      <w:r>
-        <w:t>eget</w:t>
-      </w:r>
-      <w:proofErr w:type="spellEnd"/>
-      <w:r>
-        <w:t xml:space="preserve"> </w:t>
-      </w:r>
-      <w:proofErr w:type="spellStart"/>
-      <w:r>
-        <w:t>pede</w:t>
-      </w:r>
-      <w:proofErr w:type="spellEnd"/>
-      <w:r>
-        <w:t xml:space="preserve">. Sed </w:t>
-      </w:r>
-      <w:proofErr w:type="spellStart"/>
-      <w:r>
-        <w:t>velit</w:t>
-      </w:r>
-      <w:proofErr w:type="spellEnd"/>
-      <w:r>
-        <w:t xml:space="preserve"> </w:t>
-      </w:r>
-      <w:proofErr w:type="spellStart"/>
-      <w:r>
-        <w:t>urna</w:t>
-      </w:r>
-      <w:proofErr w:type="spellEnd"/>
-      <w:r>
-        <w:t xml:space="preserve">, </w:t>
-      </w:r>
-      <w:proofErr w:type="spellStart"/>
-      <w:r>
-        <w:t>interdum</w:t>
-      </w:r>
-      <w:proofErr w:type="spellEnd"/>
-      <w:r>
-        <w:t xml:space="preserve"> vel, </w:t>
-      </w:r>
-      <w:proofErr w:type="spellStart"/>
-      <w:r>
-        <w:t>ultricies</w:t>
-      </w:r>
-      <w:proofErr w:type="spellEnd"/>
-      <w:r>
-        <w:t xml:space="preserve"> vel, </w:t>
-      </w:r>
-      <w:proofErr w:type="spellStart"/>
-      <w:r>
-        <w:t>faucibus</w:t>
-      </w:r>
-      <w:proofErr w:type="spellEnd"/>
-      <w:r>
-        <w:t xml:space="preserve"> at, </w:t>
-      </w:r>
-      <w:proofErr w:type="spellStart"/>
-      <w:r>
-        <w:t>quam</w:t>
-      </w:r>
-      <w:proofErr w:type="spellEnd"/>
-      <w:r>
-        <w:t xml:space="preserve">. Donec </w:t>
-      </w:r>
-      <w:proofErr w:type="spellStart"/>
-      <w:r>
-        <w:t>elit</w:t>
-      </w:r>
-      <w:proofErr w:type="spellEnd"/>
-      <w:r>
-        <w:t xml:space="preserve"> est, </w:t>
-      </w:r>
-      <w:proofErr w:type="spellStart"/>
-      <w:r>
-        <w:t>consectetuer</w:t>
-      </w:r>
-      <w:proofErr w:type="spellEnd"/>
-      <w:r>
-        <w:t xml:space="preserve"> </w:t>
-      </w:r>
-      <w:proofErr w:type="spellStart"/>
-      <w:r>
-        <w:t>eget</w:t>
-      </w:r>
-      <w:proofErr w:type="spellEnd"/>
-      <w:r>
-        <w:t xml:space="preserve">, </w:t>
-      </w:r>
-      <w:proofErr w:type="spellStart"/>
-      <w:r>
-        <w:t>consequat</w:t>
-      </w:r>
-      <w:proofErr w:type="spellEnd"/>
-      <w:r>
-        <w:t xml:space="preserve"> quis, tempus quis, </w:t>
-      </w:r>
-      <w:proofErr w:type="spellStart"/>
-      <w:r>
-        <w:t>wisi</w:t>
-      </w:r>
-      <w:proofErr w:type="spellEnd"/>
-      <w:r>
-        <w:t xml:space="preserve">. In in nunc. Class </w:t>
-      </w:r>
-      <w:proofErr w:type="spellStart"/>
-      <w:r>
-        <w:t>aptent</w:t>
-      </w:r>
-      <w:proofErr w:type="spellEnd"/>
-      <w:r>
-        <w:t xml:space="preserve"> </w:t>
-      </w:r>
-      <w:proofErr w:type="spellStart"/>
-      <w:r>
-        <w:t>taciti</w:t>
-      </w:r>
-      <w:proofErr w:type="spellEnd"/>
-      <w:r>
-        <w:t xml:space="preserve"> </w:t>
-      </w:r>
-      <w:proofErr w:type="spellStart"/>
-      <w:r>
-        <w:t>sociosqu</w:t>
-      </w:r>
-      <w:proofErr w:type="spellEnd"/>
-      <w:r>
-        <w:t xml:space="preserve"> </w:t>
-      </w:r>
-      <w:proofErr w:type="spellStart"/>
-      <w:r>
-        <w:t>ad</w:t>
-      </w:r>
-      <w:proofErr w:type="spellEnd"/>
-      <w:r>
-        <w:t xml:space="preserve"> </w:t>
-      </w:r>
-      <w:proofErr w:type="spellStart"/>
-      <w:r>
-        <w:t>litora</w:t>
-      </w:r>
-      <w:proofErr w:type="spellEnd"/>
-      <w:r>
-        <w:t xml:space="preserve"> </w:t>
-      </w:r>
-      <w:proofErr w:type="spellStart"/>
-      <w:r>
-        <w:t>torquent</w:t>
-      </w:r>
-      <w:proofErr w:type="spellEnd"/>
-      <w:r>
-        <w:t xml:space="preserve"> per </w:t>
-      </w:r>
-      <w:proofErr w:type="spellStart"/>
-      <w:r>
-        <w:t>conubia</w:t>
-      </w:r>
-      <w:proofErr w:type="spellEnd"/>
-      <w:r>
-        <w:t xml:space="preserve"> nostra, per </w:t>
-      </w:r>
-      <w:proofErr w:type="spellStart"/>
-      <w:r>
-        <w:t>inceptos</w:t>
-      </w:r>
-      <w:proofErr w:type="spellEnd"/>
-      <w:r>
-        <w:t xml:space="preserve"> </w:t>
-      </w:r>
-      <w:proofErr w:type="spellStart"/>
-      <w:r>
-        <w:t>hymenaeos</w:t>
-      </w:r>
-      <w:proofErr w:type="spellEnd"/>
+      <w:r>
+        <w:t>Pellentesque habitant morbi tristique senectus et netus et malesuada fames ac turpis egestas. Proin semper, ante vitae sollicitudin posuere, metus quam iaculis nibh, vitae scelerisque nunc massa eget pede. Sed velit urna, interdum vel, ultricies vel, faucibus at, quam. Donec elit est, consectetuer eget, consequat quis, tempus quis, wisi. In in nunc. Class aptent taciti sociosqu ad litora torquent per conubia nostra, per inceptos hymenaeos</w:t>
+      </w:r>
       <w:r>
         <w:t>.</w:t>
       </w:r>
@@ -6276,15 +6032,7 @@
         <w:t xml:space="preserve">Figure 1. </w:t>
       </w:r>
       <w:r>
-        <w:t xml:space="preserve">A sketch of </w:t>
-      </w:r>
-      <w:proofErr w:type="spellStart"/>
-      <w:r>
-        <w:t>Doullens</w:t>
-      </w:r>
-      <w:proofErr w:type="spellEnd"/>
-      <w:r>
-        <w:t xml:space="preserve"> town hall</w:t>
+        <w:t>A sketch of Doullens town hall</w:t>
       </w:r>
       <w:bookmarkEnd w:id="86"/>
       <w:commentRangeEnd w:id="87"/>
@@ -6431,7 +6179,7 @@
           <w:rFonts w:cstheme="majorHAnsi"/>
         </w:rPr>
       </w:pPr>
-      <w:bookmarkStart w:id="90" w:name="_Toc228126989"/>
+      <w:bookmarkStart w:id="90" w:name="_Toc228129445"/>
       <w:r>
         <w:rPr>
           <w:rFonts w:cstheme="majorHAnsi"/>
@@ -6466,7 +6214,7 @@
           <w:shd w:val="clear" w:color="auto" w:fill="FFFFFF"/>
         </w:rPr>
       </w:pPr>
-      <w:bookmarkStart w:id="92" w:name="_Toc228126990"/>
+      <w:bookmarkStart w:id="92" w:name="_Toc228129446"/>
       <w:r>
         <w:rPr>
           <w:noProof/>
@@ -6480,7 +6228,7 @@
       <w:pPr>
         <w:pStyle w:val="Heading3"/>
       </w:pPr>
-      <w:bookmarkStart w:id="93" w:name="_Toc228126991"/>
+      <w:bookmarkStart w:id="93" w:name="_Toc228129447"/>
       <w:r>
         <w:t xml:space="preserve">1.4 </w:t>
       </w:r>
@@ -6493,19 +6241,17 @@
       <w:pPr>
         <w:pStyle w:val="Heading4"/>
       </w:pPr>
-      <w:bookmarkStart w:id="94" w:name="_Toc228126992"/>
-      <w:proofErr w:type="spellStart"/>
+      <w:bookmarkStart w:id="94" w:name="_Toc228129448"/>
       <w:r>
         <w:t>QCrank</w:t>
       </w:r>
       <w:bookmarkEnd w:id="94"/>
-      <w:proofErr w:type="spellEnd"/>
     </w:p>
     <w:p>
       <w:pPr>
         <w:pStyle w:val="Heading4"/>
       </w:pPr>
-      <w:bookmarkStart w:id="95" w:name="_Toc228126993"/>
+      <w:bookmarkStart w:id="95" w:name="_Toc228129449"/>
       <w:r>
         <w:t>EHands</w:t>
       </w:r>
@@ -6515,16 +6261,11 @@
       <w:pPr>
         <w:pStyle w:val="Heading3"/>
       </w:pPr>
-      <w:bookmarkStart w:id="96" w:name="_Toc228126994"/>
-      <w:r>
-        <w:t xml:space="preserve">1.5 </w:t>
-      </w:r>
-      <w:proofErr w:type="spellStart"/>
-      <w:r>
-        <w:t>Qiskit</w:t>
+      <w:bookmarkStart w:id="96" w:name="_Toc228129450"/>
+      <w:r>
+        <w:t>1.5 Qiskit</w:t>
       </w:r>
       <w:bookmarkEnd w:id="96"/>
-      <w:proofErr w:type="spellEnd"/>
     </w:p>
     <w:p>
       <w:pPr>
@@ -6549,7 +6290,7 @@
       <w:pPr>
         <w:pStyle w:val="Heading2"/>
       </w:pPr>
-      <w:bookmarkStart w:id="97" w:name="_Toc228126995"/>
+      <w:bookmarkStart w:id="97" w:name="_Toc228129451"/>
       <w:commentRangeStart w:id="98"/>
       <w:r>
         <w:t>Chapter</w:t>
@@ -6573,7 +6314,7 @@
       <w:pPr>
         <w:pStyle w:val="Heading3"/>
       </w:pPr>
-      <w:bookmarkStart w:id="99" w:name="_Toc228126996"/>
+      <w:bookmarkStart w:id="99" w:name="_Toc228129452"/>
       <w:r>
         <w:t>2.1 Overall Circuit Architecture</w:t>
       </w:r>
@@ -7199,9 +6940,11 @@
       <w:pPr>
         <w:pStyle w:val="Heading4"/>
       </w:pPr>
+      <w:bookmarkStart w:id="100" w:name="_Toc228129453"/>
       <w:r>
         <w:t>Quantum Data Encoding</w:t>
       </w:r>
+      <w:bookmarkEnd w:id="100"/>
     </w:p>
     <w:p>
       <w:pPr>
@@ -7339,15 +7082,7 @@
       </w:r>
       <w:proofErr w:type="gramEnd"/>
       <w:r>
-        <w:t xml:space="preserve">:2026}. </w:t>
-      </w:r>
-      <w:proofErr w:type="spellStart"/>
-      <w:r>
-        <w:t>QCrank</w:t>
-      </w:r>
-      <w:proofErr w:type="spellEnd"/>
-      <w:r>
-        <w:t xml:space="preserve"> encodes </w:t>
+        <w:t xml:space="preserve">:2026}. QCrank encodes </w:t>
       </w:r>
       <m:oMath>
         <m:sSub>
@@ -8174,9 +7909,11 @@
       <w:pPr>
         <w:pStyle w:val="Heading4"/>
       </w:pPr>
+      <w:bookmarkStart w:id="101" w:name="_Toc228129454"/>
       <w:r>
         <w:t>Quantum Vertex Classification</w:t>
       </w:r>
+      <w:bookmarkEnd w:id="101"/>
     </w:p>
     <w:p>
       <w:pPr>
@@ -8670,9 +8407,11 @@
       <w:pPr>
         <w:pStyle w:val="Heading4"/>
       </w:pPr>
+      <w:bookmarkStart w:id="102" w:name="_Toc228129455"/>
       <w:r>
         <w:t>Measurement and Readout</w:t>
       </w:r>
+      <w:bookmarkEnd w:id="102"/>
     </w:p>
     <w:p>
       <w:pPr>
@@ -8802,9 +8541,11 @@
       <w:pPr>
         <w:pStyle w:val="Heading4"/>
       </w:pPr>
+      <w:bookmarkStart w:id="103" w:name="_Toc228129456"/>
       <w:r>
         <w:t>Tiling</w:t>
       </w:r>
+      <w:bookmarkEnd w:id="103"/>
     </w:p>
     <w:p>
       <w:pPr>
@@ -8900,20 +8641,22 @@
       <w:pPr>
         <w:pStyle w:val="Heading3"/>
       </w:pPr>
-      <w:bookmarkStart w:id="100" w:name="_Toc228126997"/>
+      <w:bookmarkStart w:id="104" w:name="_Toc228129457"/>
       <w:r>
         <w:lastRenderedPageBreak/>
         <w:t>2.2 EHands Arithmetic</w:t>
       </w:r>
-      <w:bookmarkEnd w:id="100"/>
+      <w:bookmarkEnd w:id="104"/>
     </w:p>
     <w:p>
       <w:pPr>
         <w:pStyle w:val="Heading4"/>
       </w:pPr>
+      <w:bookmarkStart w:id="105" w:name="_Toc228129458"/>
       <w:r>
         <w:t>EHands Weighted Summation</w:t>
       </w:r>
+      <w:bookmarkEnd w:id="105"/>
     </w:p>
     <w:p>
       <w:pPr>
@@ -8924,24 +8667,11 @@
       <w:pPr>
         <w:pStyle w:val="Heading3"/>
       </w:pPr>
-      <w:bookmarkStart w:id="101" w:name="_Toc228126998"/>
+      <w:bookmarkStart w:id="106" w:name="_Toc228129459"/>
       <w:r>
         <w:t>2.3 Classification</w:t>
       </w:r>
-      <w:bookmarkEnd w:id="101"/>
-    </w:p>
-    <w:p>
-      <w:pPr>
-        <w:pStyle w:val="Body"/>
-      </w:pPr>
-      <w:r>
-        <w:t>Placeholder</w:t>
-      </w:r>
-    </w:p>
-    <w:p>
-      <w:pPr>
-        <w:spacing w:after="200" w:line="276" w:lineRule="auto"/>
-      </w:pPr>
+      <w:bookmarkEnd w:id="106"/>
       <w:r>
         <w:br w:type="page"/>
       </w:r>
@@ -8950,18 +8680,18 @@
       <w:pPr>
         <w:pStyle w:val="Heading2"/>
       </w:pPr>
-      <w:bookmarkStart w:id="102" w:name="_Toc228126999"/>
+      <w:bookmarkStart w:id="107" w:name="_Toc228129460"/>
       <w:r>
         <w:lastRenderedPageBreak/>
         <w:t>Chapter 3: Evaluation and Results</w:t>
       </w:r>
-      <w:bookmarkEnd w:id="102"/>
+      <w:bookmarkEnd w:id="107"/>
     </w:p>
     <w:p>
       <w:pPr>
         <w:pStyle w:val="Heading3"/>
       </w:pPr>
-      <w:bookmarkStart w:id="103" w:name="_Toc228127000"/>
+      <w:bookmarkStart w:id="108" w:name="_Toc228129461"/>
       <w:r>
         <w:t>3.1 Computational platform and Software</w:t>
       </w:r>
@@ -8971,23 +8701,23 @@
       <w:r>
         <w:t>Environment</w:t>
       </w:r>
-      <w:bookmarkEnd w:id="103"/>
+      <w:bookmarkEnd w:id="108"/>
     </w:p>
     <w:p>
       <w:pPr>
         <w:pStyle w:val="Heading3"/>
       </w:pPr>
-      <w:bookmarkStart w:id="104" w:name="_Toc228127001"/>
+      <w:bookmarkStart w:id="109" w:name="_Toc228129462"/>
       <w:r>
         <w:t>3.2 Methodology</w:t>
       </w:r>
-      <w:bookmarkEnd w:id="104"/>
+      <w:bookmarkEnd w:id="109"/>
     </w:p>
     <w:p>
       <w:pPr>
         <w:pStyle w:val="Heading3"/>
       </w:pPr>
-      <w:bookmarkStart w:id="105" w:name="_Toc228127002"/>
+      <w:bookmarkStart w:id="110" w:name="_Toc228129463"/>
       <w:r>
         <w:t xml:space="preserve">3.3 Experiment 1: </w:t>
       </w:r>
@@ -9000,23 +8730,23 @@
       <w:r>
         <w:t>Quantum Arithmetic Computations</w:t>
       </w:r>
-      <w:bookmarkEnd w:id="105"/>
+      <w:bookmarkEnd w:id="110"/>
     </w:p>
     <w:p>
       <w:pPr>
         <w:pStyle w:val="Heading3"/>
       </w:pPr>
-      <w:bookmarkStart w:id="106" w:name="_Toc228127003"/>
+      <w:bookmarkStart w:id="111" w:name="_Toc228129464"/>
       <w:r>
         <w:t>3.4 Experiment 2: Testing Isovalue Weight Encoding</w:t>
       </w:r>
-      <w:bookmarkEnd w:id="106"/>
+      <w:bookmarkEnd w:id="111"/>
     </w:p>
     <w:p>
       <w:pPr>
         <w:pStyle w:val="Heading3"/>
       </w:pPr>
-      <w:bookmarkStart w:id="107" w:name="_Toc228127004"/>
+      <w:bookmarkStart w:id="112" w:name="_Toc228129465"/>
       <w:r>
         <w:t xml:space="preserve">3.5 </w:t>
       </w:r>
@@ -9035,33 +8765,33 @@
       <w:r>
         <w:t>Fixed Size Image</w:t>
       </w:r>
-      <w:bookmarkEnd w:id="107"/>
+      <w:bookmarkEnd w:id="112"/>
     </w:p>
     <w:p>
       <w:pPr>
         <w:pStyle w:val="Heading3"/>
       </w:pPr>
-      <w:bookmarkStart w:id="108" w:name="_Toc228127005"/>
+      <w:bookmarkStart w:id="113" w:name="_Toc228129466"/>
       <w:r>
         <w:t>3.6 Experiment 4: Shift to 3D data</w:t>
       </w:r>
-      <w:bookmarkEnd w:id="108"/>
+      <w:bookmarkEnd w:id="113"/>
     </w:p>
     <w:p>
       <w:pPr>
         <w:pStyle w:val="Heading3"/>
       </w:pPr>
-      <w:bookmarkStart w:id="109" w:name="_Toc228127006"/>
+      <w:bookmarkStart w:id="114" w:name="_Toc228129467"/>
       <w:r>
         <w:t>3.7 Experiment 5: Running on Real Quantum Hardware</w:t>
       </w:r>
-      <w:bookmarkEnd w:id="109"/>
+      <w:bookmarkEnd w:id="114"/>
     </w:p>
     <w:p>
       <w:pPr>
         <w:pStyle w:val="Heading3"/>
       </w:pPr>
-      <w:bookmarkStart w:id="110" w:name="_Toc228127007"/>
+      <w:bookmarkStart w:id="115" w:name="_Toc228129468"/>
       <w:r>
         <w:t>3.</w:t>
       </w:r>
@@ -9071,7 +8801,7 @@
       <w:r>
         <w:t xml:space="preserve"> Findings and Discussion</w:t>
       </w:r>
-      <w:bookmarkEnd w:id="110"/>
+      <w:bookmarkEnd w:id="115"/>
       <w:r>
         <w:br w:type="page"/>
       </w:r>
@@ -9080,12 +8810,12 @@
       <w:pPr>
         <w:pStyle w:val="Heading2"/>
       </w:pPr>
-      <w:bookmarkStart w:id="111" w:name="_Toc228127008"/>
+      <w:bookmarkStart w:id="116" w:name="_Toc228129469"/>
       <w:r>
         <w:lastRenderedPageBreak/>
         <w:t>Chapter 4: Conclusion</w:t>
       </w:r>
-      <w:bookmarkEnd w:id="111"/>
+      <w:bookmarkEnd w:id="116"/>
     </w:p>
     <w:p>
       <w:pPr>
@@ -9109,12 +8839,12 @@
       <w:pPr>
         <w:pStyle w:val="Heading2"/>
       </w:pPr>
-      <w:bookmarkStart w:id="112" w:name="_Toc228127009"/>
+      <w:bookmarkStart w:id="117" w:name="_Toc228129470"/>
       <w:r>
         <w:lastRenderedPageBreak/>
         <w:t>FORMATING GUIDE CHAPTER TO REMOVE LATER</w:t>
       </w:r>
-      <w:bookmarkEnd w:id="112"/>
+      <w:bookmarkEnd w:id="117"/>
       <w:r>
         <w:t xml:space="preserve"> </w:t>
       </w:r>
@@ -9123,11 +8853,11 @@
       <w:pPr>
         <w:pStyle w:val="Heading3"/>
       </w:pPr>
-      <w:bookmarkStart w:id="113" w:name="_Toc228127010"/>
+      <w:bookmarkStart w:id="118" w:name="_Toc228129471"/>
       <w:r>
         <w:t>SUBHEADER 3</w:t>
       </w:r>
-      <w:bookmarkEnd w:id="113"/>
+      <w:bookmarkEnd w:id="118"/>
     </w:p>
     <w:p>
       <w:pPr>
@@ -9149,11 +8879,11 @@
       <w:pPr>
         <w:pStyle w:val="TableTitle"/>
       </w:pPr>
-      <w:commentRangeStart w:id="114"/>
+      <w:commentRangeStart w:id="119"/>
       <w:r>
         <w:t>Table 1. Number of Students, 2016-2019</w:t>
       </w:r>
-      <w:commentRangeEnd w:id="114"/>
+      <w:commentRangeEnd w:id="119"/>
       <w:r>
         <w:rPr>
           <w:rStyle w:val="CommentReference"/>
@@ -9161,7 +8891,7 @@
           <w:sz w:val="24"/>
           <w:szCs w:val="24"/>
         </w:rPr>
-        <w:commentReference w:id="114"/>
+        <w:commentReference w:id="119"/>
       </w:r>
     </w:p>
     <w:tbl>
@@ -9195,7 +8925,7 @@
                 <w:bCs/>
               </w:rPr>
             </w:pPr>
-            <w:commentRangeStart w:id="115"/>
+            <w:commentRangeStart w:id="120"/>
             <w:r>
               <w:rPr>
                 <w:b/>
@@ -9367,12 +9097,12 @@
             <w:r>
               <w:t>12,743</w:t>
             </w:r>
-            <w:commentRangeEnd w:id="115"/>
+            <w:commentRangeEnd w:id="120"/>
             <w:r>
               <w:rPr>
                 <w:rStyle w:val="CommentReference"/>
               </w:rPr>
-              <w:commentReference w:id="115"/>
+              <w:commentReference w:id="120"/>
             </w:r>
           </w:p>
         </w:tc>
@@ -9383,7 +9113,7 @@
         <w:pStyle w:val="Caption"/>
         <w:jc w:val="center"/>
       </w:pPr>
-      <w:commentRangeStart w:id="116"/>
+      <w:commentRangeStart w:id="121"/>
       <w:r>
         <w:t xml:space="preserve">Table </w:t>
       </w:r>
@@ -9432,7 +9162,7 @@
       <w:r>
         <w:t>explain how a table relates to the surrounding text.</w:t>
       </w:r>
-      <w:commentRangeEnd w:id="116"/>
+      <w:commentRangeEnd w:id="121"/>
       <w:r>
         <w:rPr>
           <w:rStyle w:val="CommentReference"/>
@@ -9440,7 +9170,7 @@
           <w:iCs w:val="0"/>
           <w:color w:val="auto"/>
         </w:rPr>
-        <w:commentReference w:id="116"/>
+        <w:commentReference w:id="121"/>
       </w:r>
     </w:p>
     <w:p>
@@ -9487,7 +9217,7 @@
       <w:pPr>
         <w:pStyle w:val="TableTitle"/>
       </w:pPr>
-      <w:commentRangeStart w:id="117"/>
+      <w:commentRangeStart w:id="122"/>
       <w:r>
         <w:t xml:space="preserve">Table </w:t>
       </w:r>
@@ -9500,7 +9230,7 @@
       <w:r>
         <w:t xml:space="preserve"> Responses to Survey Question 1</w:t>
       </w:r>
-      <w:commentRangeEnd w:id="117"/>
+      <w:commentRangeEnd w:id="122"/>
       <w:r>
         <w:rPr>
           <w:rStyle w:val="CommentReference"/>
@@ -9508,7 +9238,7 @@
           <w:sz w:val="24"/>
           <w:szCs w:val="24"/>
         </w:rPr>
-        <w:commentReference w:id="117"/>
+        <w:commentReference w:id="122"/>
       </w:r>
     </w:p>
     <w:p>
@@ -9517,7 +9247,7 @@
         <w:ind w:firstLine="0"/>
         <w:jc w:val="center"/>
       </w:pPr>
-      <w:commentRangeStart w:id="118"/>
+      <w:commentRangeStart w:id="123"/>
       <w:r>
         <w:rPr>
           <w:noProof/>
@@ -9558,12 +9288,12 @@
           </wp:inline>
         </w:drawing>
       </w:r>
-      <w:commentRangeEnd w:id="118"/>
+      <w:commentRangeEnd w:id="123"/>
       <w:r>
         <w:rPr>
           <w:rStyle w:val="CommentReference"/>
         </w:rPr>
-        <w:commentReference w:id="118"/>
+        <w:commentReference w:id="123"/>
       </w:r>
     </w:p>
     <w:p>
@@ -9571,7 +9301,7 @@
         <w:pStyle w:val="Caption"/>
         <w:jc w:val="center"/>
       </w:pPr>
-      <w:commentRangeStart w:id="119"/>
+      <w:commentRangeStart w:id="124"/>
       <w:r>
         <w:t xml:space="preserve">Table </w:t>
       </w:r>
@@ -9620,7 +9350,7 @@
       <w:r>
         <w:t xml:space="preserve"> explain how a table relates to the surrounding text.</w:t>
       </w:r>
-      <w:commentRangeEnd w:id="119"/>
+      <w:commentRangeEnd w:id="124"/>
       <w:r>
         <w:rPr>
           <w:rStyle w:val="CommentReference"/>
@@ -9628,7 +9358,7 @@
           <w:iCs w:val="0"/>
           <w:color w:val="auto"/>
         </w:rPr>
-        <w:commentReference w:id="119"/>
+        <w:commentReference w:id="124"/>
       </w:r>
     </w:p>
     <w:p>
@@ -9651,20 +9381,20 @@
         <w:pStyle w:val="FigureTitle"/>
         <w:ind w:firstLine="0"/>
       </w:pPr>
-      <w:commentRangeStart w:id="120"/>
+      <w:commentRangeStart w:id="125"/>
       <w:r>
         <w:t>Figure 2. Marine Algae in</w:t>
       </w:r>
       <w:r>
         <w:t xml:space="preserve"> Sweden</w:t>
       </w:r>
-      <w:commentRangeEnd w:id="120"/>
+      <w:commentRangeEnd w:id="125"/>
       <w:r>
         <w:rPr>
           <w:rStyle w:val="CommentReference"/>
           <w:rFonts w:asciiTheme="minorHAnsi" w:eastAsiaTheme="minorHAnsi" w:hAnsiTheme="minorHAnsi" w:cstheme="minorBidi"/>
         </w:rPr>
-        <w:commentReference w:id="120"/>
+        <w:commentReference w:id="125"/>
       </w:r>
     </w:p>
     <w:p>
@@ -9674,7 +9404,7 @@
         <w:ind w:firstLine="0"/>
         <w:jc w:val="center"/>
       </w:pPr>
-      <w:commentRangeStart w:id="121"/>
+      <w:commentRangeStart w:id="126"/>
       <w:r>
         <w:rPr>
           <w:b/>
@@ -9724,14 +9454,14 @@
           </wp:inline>
         </w:drawing>
       </w:r>
-      <w:commentRangeEnd w:id="121"/>
+      <w:commentRangeEnd w:id="126"/>
     </w:p>
     <w:p>
       <w:pPr>
         <w:pStyle w:val="Caption"/>
         <w:jc w:val="center"/>
       </w:pPr>
-      <w:commentRangeStart w:id="122"/>
+      <w:commentRangeStart w:id="127"/>
       <w:r>
         <w:t xml:space="preserve">Figure </w:t>
       </w:r>
@@ -9758,24 +9488,22 @@
       <w:r>
         <w:t xml:space="preserve"> about 3.3 ft. high, and the bottom is covered with soft blanket weed (Cladophora glomerata). Photo by </w:t>
       </w:r>
-      <w:proofErr w:type="spellStart"/>
       <w:proofErr w:type="gramStart"/>
       <w:r>
         <w:t>W.carter</w:t>
       </w:r>
-      <w:proofErr w:type="spellEnd"/>
       <w:proofErr w:type="gramEnd"/>
       <w:r>
         <w:t>, CC0 1.0 Universal.</w:t>
       </w:r>
-      <w:commentRangeEnd w:id="122"/>
+      <w:commentRangeEnd w:id="127"/>
       <w:r>
         <w:rPr>
           <w:rStyle w:val="CommentReference"/>
           <w:i w:val="0"/>
           <w:iCs w:val="0"/>
         </w:rPr>
-        <w:commentReference w:id="122"/>
+        <w:commentReference w:id="127"/>
       </w:r>
     </w:p>
     <w:p>
@@ -9791,7 +9519,7 @@
           <w:rStyle w:val="CommentReference"/>
           <w:rFonts w:asciiTheme="minorHAnsi" w:eastAsiaTheme="minorHAnsi" w:hAnsiTheme="minorHAnsi" w:cstheme="minorBidi"/>
         </w:rPr>
-        <w:commentReference w:id="121"/>
+        <w:commentReference w:id="126"/>
       </w:r>
       <w:r>
         <w:rPr>
@@ -9821,12 +9549,12 @@
       <w:pPr>
         <w:pStyle w:val="Heading4"/>
       </w:pPr>
-      <w:bookmarkStart w:id="123" w:name="_Toc228127011"/>
-      <w:commentRangeStart w:id="124"/>
+      <w:bookmarkStart w:id="128" w:name="_Toc228129472"/>
+      <w:commentRangeStart w:id="129"/>
       <w:r>
         <w:t>Chapter Heading 4 (Sub-subheading)</w:t>
       </w:r>
-      <w:commentRangeEnd w:id="124"/>
+      <w:commentRangeEnd w:id="129"/>
       <w:r>
         <w:rPr>
           <w:rStyle w:val="CommentReference"/>
@@ -9834,9 +9562,9 @@
           <w:sz w:val="24"/>
           <w:szCs w:val="24"/>
         </w:rPr>
-        <w:commentReference w:id="124"/>
-      </w:r>
-      <w:bookmarkEnd w:id="123"/>
+        <w:commentReference w:id="129"/>
+      </w:r>
+      <w:bookmarkEnd w:id="128"/>
     </w:p>
     <w:p>
       <w:pPr>
@@ -9900,13 +9628,13 @@
       <w:pPr>
         <w:pStyle w:val="Heading2"/>
       </w:pPr>
-      <w:bookmarkStart w:id="125" w:name="_Toc228127012"/>
-      <w:commentRangeStart w:id="126"/>
+      <w:bookmarkStart w:id="130" w:name="_Toc228129473"/>
+      <w:commentRangeStart w:id="131"/>
       <w:r>
         <w:lastRenderedPageBreak/>
         <w:t>References/Bibliography/Works Cited</w:t>
       </w:r>
-      <w:commentRangeEnd w:id="126"/>
+      <w:commentRangeEnd w:id="131"/>
       <w:r>
         <w:rPr>
           <w:rStyle w:val="CommentReference"/>
@@ -9914,16 +9642,16 @@
           <w:b w:val="0"/>
           <w:bCs w:val="0"/>
         </w:rPr>
-        <w:commentReference w:id="126"/>
-      </w:r>
-      <w:bookmarkEnd w:id="125"/>
+        <w:commentReference w:id="131"/>
+      </w:r>
+      <w:bookmarkEnd w:id="130"/>
     </w:p>
     <w:p>
       <w:pPr>
         <w:pStyle w:val="Body"/>
         <w:ind w:left="720" w:hanging="720"/>
       </w:pPr>
-      <w:commentRangeStart w:id="127"/>
+      <w:commentRangeStart w:id="132"/>
       <w:r>
         <w:t>Grady, J. S., Her, M., Moreno, G., Perez, C., &amp; Yelinek, J. (2019). Emotions in storybooks: A comparison of storybooks that represent ethnic and racial groups in the United States. </w:t>
       </w:r>
@@ -9986,34 +9714,18 @@
           <w:i/>
           <w:iCs/>
         </w:rPr>
-        <w:t> </w:t>
-      </w:r>
-      <w:proofErr w:type="spellStart"/>
-      <w:r>
-        <w:rPr>
-          <w:i/>
-          <w:iCs/>
-        </w:rPr>
-        <w:t>Ebsco</w:t>
-      </w:r>
-      <w:proofErr w:type="spellEnd"/>
-      <w:r>
-        <w:rPr>
-          <w:i/>
-          <w:iCs/>
-        </w:rPr>
-        <w:t>, </w:t>
+        <w:t> Ebsco, </w:t>
       </w:r>
       <w:r>
         <w:t>Access no: 24984616.</w:t>
       </w:r>
-      <w:commentRangeEnd w:id="127"/>
+      <w:commentRangeEnd w:id="132"/>
       <w:r>
         <w:rPr>
           <w:rStyle w:val="CommentReference"/>
           <w:rFonts w:asciiTheme="minorHAnsi" w:eastAsiaTheme="minorHAnsi" w:hAnsiTheme="minorHAnsi" w:cstheme="minorBidi"/>
         </w:rPr>
-        <w:commentReference w:id="127"/>
+        <w:commentReference w:id="132"/>
       </w:r>
     </w:p>
     <w:p>
@@ -10061,14 +9773,14 @@
       <w:pPr>
         <w:pStyle w:val="Heading2"/>
       </w:pPr>
-      <w:bookmarkStart w:id="128" w:name="_Toc57187045"/>
-      <w:bookmarkStart w:id="129" w:name="_Toc228127013"/>
-      <w:commentRangeStart w:id="130"/>
+      <w:bookmarkStart w:id="133" w:name="_Toc57187045"/>
+      <w:bookmarkStart w:id="134" w:name="_Toc228129474"/>
+      <w:commentRangeStart w:id="135"/>
       <w:r>
         <w:lastRenderedPageBreak/>
         <w:t>Appendix/Appendices</w:t>
       </w:r>
-      <w:commentRangeEnd w:id="130"/>
+      <w:commentRangeEnd w:id="135"/>
       <w:r>
         <w:rPr>
           <w:rStyle w:val="CommentReference"/>
@@ -10076,28 +9788,28 @@
           <w:b w:val="0"/>
           <w:bCs w:val="0"/>
         </w:rPr>
-        <w:commentReference w:id="130"/>
-      </w:r>
-      <w:bookmarkEnd w:id="129"/>
+        <w:commentReference w:id="135"/>
+      </w:r>
+      <w:bookmarkEnd w:id="134"/>
     </w:p>
     <w:p>
       <w:pPr>
         <w:pStyle w:val="AppendixTitle"/>
       </w:pPr>
-      <w:commentRangeStart w:id="131"/>
+      <w:commentRangeStart w:id="136"/>
       <w:r>
         <w:t>Appendix A: List of California State University Campuses</w:t>
       </w:r>
-      <w:commentRangeEnd w:id="131"/>
+      <w:commentRangeEnd w:id="136"/>
       <w:r>
         <w:rPr>
           <w:rStyle w:val="CommentReference"/>
           <w:rFonts w:asciiTheme="minorHAnsi" w:eastAsiaTheme="minorHAnsi" w:hAnsiTheme="minorHAnsi" w:cstheme="minorBidi"/>
           <w:b w:val="0"/>
         </w:rPr>
-        <w:commentReference w:id="131"/>
-      </w:r>
-      <w:bookmarkEnd w:id="128"/>
+        <w:commentReference w:id="136"/>
+      </w:r>
+      <w:bookmarkEnd w:id="133"/>
     </w:p>
     <w:p>
       <w:pPr>
@@ -10207,21 +9919,21 @@
       <w:pPr>
         <w:pStyle w:val="AppendixTitle"/>
       </w:pPr>
-      <w:bookmarkStart w:id="132" w:name="_Toc57187046"/>
-      <w:commentRangeStart w:id="133"/>
+      <w:bookmarkStart w:id="137" w:name="_Toc57187046"/>
+      <w:commentRangeStart w:id="138"/>
       <w:r>
         <w:lastRenderedPageBreak/>
         <w:t>Appendix B: Abbreviations of California State University Campuses</w:t>
       </w:r>
-      <w:bookmarkEnd w:id="132"/>
-      <w:commentRangeEnd w:id="133"/>
+      <w:bookmarkEnd w:id="137"/>
+      <w:commentRangeEnd w:id="138"/>
       <w:r>
         <w:rPr>
           <w:rStyle w:val="CommentReference"/>
           <w:rFonts w:asciiTheme="minorHAnsi" w:eastAsiaTheme="minorHAnsi" w:hAnsiTheme="minorHAnsi" w:cstheme="minorBidi"/>
           <w:b w:val="0"/>
         </w:rPr>
-        <w:commentReference w:id="133"/>
+        <w:commentReference w:id="138"/>
       </w:r>
     </w:p>
     <w:p>
@@ -13519,7 +13231,7 @@
       </w:r>
     </w:p>
   </w:comment>
-  <w:comment w:id="114" w:author="Author" w:initials="A">
+  <w:comment w:id="119" w:author="Author" w:initials="A">
     <w:p>
       <w:pPr>
         <w:pStyle w:val="CommentText"/>
@@ -13614,7 +13326,7 @@
       </w:r>
     </w:p>
   </w:comment>
-  <w:comment w:id="115" w:author="Author" w:initials="A">
+  <w:comment w:id="120" w:author="Author" w:initials="A">
     <w:p>
       <w:pPr>
         <w:pStyle w:val="CommentText"/>
@@ -13771,7 +13483,7 @@
       </w:r>
     </w:p>
   </w:comment>
-  <w:comment w:id="116" w:author="Author" w:initials="A">
+  <w:comment w:id="121" w:author="Author" w:initials="A">
     <w:p>
       <w:pPr>
         <w:pStyle w:val="CommentText"/>
@@ -13887,7 +13599,7 @@
       </w:r>
     </w:p>
   </w:comment>
-  <w:comment w:id="117" w:author="Author" w:initials="A">
+  <w:comment w:id="122" w:author="Author" w:initials="A">
     <w:p>
       <w:pPr>
         <w:pStyle w:val="CommentText"/>
@@ -13989,7 +13701,7 @@
       </w:r>
     </w:p>
   </w:comment>
-  <w:comment w:id="118" w:author="Author" w:initials="A">
+  <w:comment w:id="123" w:author="Author" w:initials="A">
     <w:p>
       <w:pPr>
         <w:rPr>
@@ -14119,7 +13831,7 @@
       </w:r>
     </w:p>
   </w:comment>
-  <w:comment w:id="119" w:author="Author" w:initials="A">
+  <w:comment w:id="124" w:author="Author" w:initials="A">
     <w:p>
       <w:pPr>
         <w:pStyle w:val="CommentText"/>
@@ -14235,7 +13947,7 @@
       </w:r>
     </w:p>
   </w:comment>
-  <w:comment w:id="120" w:author="Author" w:initials="A">
+  <w:comment w:id="125" w:author="Author" w:initials="A">
     <w:p>
       <w:pPr>
         <w:pStyle w:val="CommentText"/>
@@ -14350,7 +14062,7 @@
       </w:r>
     </w:p>
   </w:comment>
-  <w:comment w:id="122" w:author="Author" w:initials="A">
+  <w:comment w:id="127" w:author="Author" w:initials="A">
     <w:p>
       <w:pPr>
         <w:pStyle w:val="CommentText"/>
@@ -14466,7 +14178,7 @@
       </w:r>
     </w:p>
   </w:comment>
-  <w:comment w:id="121" w:author="Author" w:initials="A">
+  <w:comment w:id="126" w:author="Author" w:initials="A">
     <w:p>
       <w:pPr>
         <w:rPr>
@@ -14710,7 +14422,7 @@
       </w:r>
     </w:p>
   </w:comment>
-  <w:comment w:id="124" w:author="Author" w:initials="A">
+  <w:comment w:id="129" w:author="Author" w:initials="A">
     <w:p>
       <w:pPr>
         <w:pStyle w:val="CommentText"/>
@@ -14818,7 +14530,7 @@
       </w:r>
     </w:p>
   </w:comment>
-  <w:comment w:id="126" w:author="Author" w:initials="A">
+  <w:comment w:id="131" w:author="Author" w:initials="A">
     <w:p>
       <w:pPr>
         <w:pStyle w:val="CommentText"/>
@@ -14934,7 +14646,7 @@
       </w:r>
     </w:p>
   </w:comment>
-  <w:comment w:id="127" w:author="Author" w:initials="A">
+  <w:comment w:id="132" w:author="Author" w:initials="A">
     <w:p>
       <w:pPr>
         <w:pStyle w:val="CommentText"/>
@@ -14956,7 +14668,7 @@
       </w:r>
     </w:p>
   </w:comment>
-  <w:comment w:id="130" w:author="Author" w:initials="A">
+  <w:comment w:id="135" w:author="Author" w:initials="A">
     <w:p>
       <w:pPr>
         <w:pStyle w:val="CommentText"/>
@@ -15165,7 +14877,7 @@
       </w:r>
     </w:p>
   </w:comment>
-  <w:comment w:id="131" w:author="Author" w:initials="A">
+  <w:comment w:id="136" w:author="Author" w:initials="A">
     <w:p>
       <w:pPr>
         <w:pStyle w:val="CommentText"/>
@@ -15181,7 +14893,7 @@
       </w:r>
     </w:p>
   </w:comment>
-  <w:comment w:id="133" w:author="Author" w:initials="A">
+  <w:comment w:id="138" w:author="Author" w:initials="A">
     <w:p>
       <w:pPr>
         <w:pStyle w:val="CommentText"/>
@@ -21623,7 +21335,6 @@
     <w:rsid w:val="00CA739B"/>
     <w:rsid w:val="00CD2EB1"/>
     <w:rsid w:val="00CE597C"/>
-    <w:rsid w:val="00CF554D"/>
     <w:rsid w:val="00D10D55"/>
     <w:rsid w:val="00D17F17"/>
     <w:rsid w:val="00D32C19"/>
@@ -21633,6 +21344,7 @@
     <w:rsid w:val="00E02DAA"/>
     <w:rsid w:val="00E21171"/>
     <w:rsid w:val="00E253A2"/>
+    <w:rsid w:val="00E35A0E"/>
     <w:rsid w:val="00E53962"/>
     <w:rsid w:val="00E63160"/>
     <w:rsid w:val="00E70DF3"/>

</xml_diff>